<commit_message>
Refine documentation and improve clarity in assignment report and notebook
</commit_message>
<xml_diff>
--- a/BCS102_Assignment_Report_DRAFT.docx
+++ b/BCS102_Assignment_Report_DRAFT.docx
@@ -4745,7 +4745,7 @@
           <w:i/>
           <w:sz w:val="20"/>
         </w:rPr>
-        <w:t>Screenshot 4b. Categorical value validation – proves every categorical column contains only its documented values (e.g. Gender is exactly {Male, Female}) with no unexpected categories or blank/whitespace-only entries.</w:t>
+        <w:t>Screenshot 4b. Categorical value validation: proves every categorical column contains only its documented values (e.g. Gender is exactly {Male, Female}) with no unexpected categories or blank/whitespace-only entries.</w:t>
       </w:r>
     </w:p>
     <w:p>
@@ -5179,7 +5179,7 @@
           <w:i/>
           <w:sz w:val="20"/>
         </w:rPr>
-        <w:t xml:space="preserve">Screenshot 10b. Proof of training – </w:t>
+        <w:t>Screenshot 10b. Proof of training: sklearn</w:t>
       </w:r>
       <w:proofErr w:type="spellStart"/>
       <w:r>
@@ -5187,7 +5187,7 @@
           <w:i/>
           <w:sz w:val="20"/>
         </w:rPr>
-        <w:t>sklearn's</w:t>
+        <w:t>'s</w:t>
       </w:r>
       <w:proofErr w:type="spellEnd"/>
       <w:r>

</xml_diff>

<commit_message>
paraphrased 1 to 6
pending 7 until 11 :(
</commit_message>
<xml_diff>
--- a/BCS102_Assignment_Report_DRAFT.docx
+++ b/BCS102_Assignment_Report_DRAFT.docx
@@ -37,10 +37,9 @@
         </w:tabs>
         <w:rPr>
           <w:rFonts w:asciiTheme="minorHAnsi" w:eastAsiaTheme="minorEastAsia" w:hAnsiTheme="minorHAnsi"/>
-          <w:noProof/>
           <w:kern w:val="2"/>
           <w:szCs w:val="30"/>
-          <w:lang w:val="en-MY" w:eastAsia="zh-CN" w:bidi="th-TH"/>
+          <w:lang w:eastAsia="zh-CN" w:bidi="th-TH"/>
           <w14:ligatures w14:val="standardContextual"/>
         </w:rPr>
       </w:pPr>
@@ -57,54 +56,46 @@
         <w:r>
           <w:rPr>
             <w:rStyle w:val="Hyperlink"/>
-            <w:noProof/>
           </w:rPr>
           <w:t>1. Introduction</w:t>
         </w:r>
         <w:r>
           <w:rPr>
-            <w:noProof/>
             <w:webHidden/>
           </w:rPr>
           <w:tab/>
         </w:r>
         <w:r>
           <w:rPr>
-            <w:noProof/>
             <w:webHidden/>
           </w:rPr>
           <w:fldChar w:fldCharType="begin"/>
         </w:r>
         <w:r>
           <w:rPr>
-            <w:noProof/>
             <w:webHidden/>
           </w:rPr>
           <w:instrText xml:space="preserve"> PAGEREF _Toc235547028 \h </w:instrText>
         </w:r>
         <w:r>
           <w:rPr>
-            <w:noProof/>
             <w:webHidden/>
           </w:rPr>
         </w:r>
         <w:r>
           <w:rPr>
-            <w:noProof/>
             <w:webHidden/>
           </w:rPr>
           <w:fldChar w:fldCharType="separate"/>
         </w:r>
         <w:r>
           <w:rPr>
-            <w:noProof/>
             <w:webHidden/>
           </w:rPr>
           <w:t>3</w:t>
         </w:r>
         <w:r>
           <w:rPr>
-            <w:noProof/>
             <w:webHidden/>
           </w:rPr>
           <w:fldChar w:fldCharType="end"/>
@@ -119,10 +110,9 @@
         </w:tabs>
         <w:rPr>
           <w:rFonts w:asciiTheme="minorHAnsi" w:eastAsiaTheme="minorEastAsia" w:hAnsiTheme="minorHAnsi"/>
-          <w:noProof/>
           <w:kern w:val="2"/>
           <w:szCs w:val="30"/>
-          <w:lang w:val="en-MY" w:eastAsia="zh-CN" w:bidi="th-TH"/>
+          <w:lang w:eastAsia="zh-CN" w:bidi="th-TH"/>
           <w14:ligatures w14:val="standardContextual"/>
         </w:rPr>
       </w:pPr>
@@ -130,54 +120,46 @@
         <w:r>
           <w:rPr>
             <w:rStyle w:val="Hyperlink"/>
-            <w:noProof/>
           </w:rPr>
           <w:t>2. Dataset Description and Collection</w:t>
         </w:r>
         <w:r>
           <w:rPr>
-            <w:noProof/>
             <w:webHidden/>
           </w:rPr>
           <w:tab/>
         </w:r>
         <w:r>
           <w:rPr>
-            <w:noProof/>
             <w:webHidden/>
           </w:rPr>
           <w:fldChar w:fldCharType="begin"/>
         </w:r>
         <w:r>
           <w:rPr>
-            <w:noProof/>
             <w:webHidden/>
           </w:rPr>
           <w:instrText xml:space="preserve"> PAGEREF _Toc235547029 \h </w:instrText>
         </w:r>
         <w:r>
           <w:rPr>
-            <w:noProof/>
             <w:webHidden/>
           </w:rPr>
         </w:r>
         <w:r>
           <w:rPr>
-            <w:noProof/>
             <w:webHidden/>
           </w:rPr>
           <w:fldChar w:fldCharType="separate"/>
         </w:r>
         <w:r>
           <w:rPr>
-            <w:noProof/>
             <w:webHidden/>
           </w:rPr>
           <w:t>3</w:t>
         </w:r>
         <w:r>
           <w:rPr>
-            <w:noProof/>
             <w:webHidden/>
           </w:rPr>
           <w:fldChar w:fldCharType="end"/>
@@ -192,10 +174,9 @@
         </w:tabs>
         <w:rPr>
           <w:rFonts w:asciiTheme="minorHAnsi" w:eastAsiaTheme="minorEastAsia" w:hAnsiTheme="minorHAnsi"/>
-          <w:noProof/>
           <w:kern w:val="2"/>
           <w:szCs w:val="30"/>
-          <w:lang w:val="en-MY" w:eastAsia="zh-CN" w:bidi="th-TH"/>
+          <w:lang w:eastAsia="zh-CN" w:bidi="th-TH"/>
           <w14:ligatures w14:val="standardContextual"/>
         </w:rPr>
       </w:pPr>
@@ -203,54 +184,46 @@
         <w:r>
           <w:rPr>
             <w:rStyle w:val="Hyperlink"/>
-            <w:noProof/>
           </w:rPr>
           <w:t>3. Data Exploration</w:t>
         </w:r>
         <w:r>
           <w:rPr>
-            <w:noProof/>
             <w:webHidden/>
           </w:rPr>
           <w:tab/>
         </w:r>
         <w:r>
           <w:rPr>
-            <w:noProof/>
             <w:webHidden/>
           </w:rPr>
           <w:fldChar w:fldCharType="begin"/>
         </w:r>
         <w:r>
           <w:rPr>
-            <w:noProof/>
             <w:webHidden/>
           </w:rPr>
           <w:instrText xml:space="preserve"> PAGEREF _Toc235547030 \h </w:instrText>
         </w:r>
         <w:r>
           <w:rPr>
-            <w:noProof/>
             <w:webHidden/>
           </w:rPr>
         </w:r>
         <w:r>
           <w:rPr>
-            <w:noProof/>
             <w:webHidden/>
           </w:rPr>
           <w:fldChar w:fldCharType="separate"/>
         </w:r>
         <w:r>
           <w:rPr>
-            <w:noProof/>
             <w:webHidden/>
           </w:rPr>
           <w:t>5</w:t>
         </w:r>
         <w:r>
           <w:rPr>
-            <w:noProof/>
             <w:webHidden/>
           </w:rPr>
           <w:fldChar w:fldCharType="end"/>
@@ -265,10 +238,9 @@
         </w:tabs>
         <w:rPr>
           <w:rFonts w:asciiTheme="minorHAnsi" w:eastAsiaTheme="minorEastAsia" w:hAnsiTheme="minorHAnsi"/>
-          <w:noProof/>
           <w:kern w:val="2"/>
           <w:szCs w:val="30"/>
-          <w:lang w:val="en-MY" w:eastAsia="zh-CN" w:bidi="th-TH"/>
+          <w:lang w:eastAsia="zh-CN" w:bidi="th-TH"/>
           <w14:ligatures w14:val="standardContextual"/>
         </w:rPr>
       </w:pPr>
@@ -276,54 +248,46 @@
         <w:r>
           <w:rPr>
             <w:rStyle w:val="Hyperlink"/>
-            <w:noProof/>
           </w:rPr>
           <w:t>4. Exploratory Data Analysis and Visualisation</w:t>
         </w:r>
         <w:r>
           <w:rPr>
-            <w:noProof/>
             <w:webHidden/>
           </w:rPr>
           <w:tab/>
         </w:r>
         <w:r>
           <w:rPr>
-            <w:noProof/>
             <w:webHidden/>
           </w:rPr>
           <w:fldChar w:fldCharType="begin"/>
         </w:r>
         <w:r>
           <w:rPr>
-            <w:noProof/>
             <w:webHidden/>
           </w:rPr>
           <w:instrText xml:space="preserve"> PAGEREF _Toc235547031 \h </w:instrText>
         </w:r>
         <w:r>
           <w:rPr>
-            <w:noProof/>
             <w:webHidden/>
           </w:rPr>
         </w:r>
         <w:r>
           <w:rPr>
-            <w:noProof/>
             <w:webHidden/>
           </w:rPr>
           <w:fldChar w:fldCharType="separate"/>
         </w:r>
         <w:r>
           <w:rPr>
-            <w:noProof/>
             <w:webHidden/>
           </w:rPr>
           <w:t>5</w:t>
         </w:r>
         <w:r>
           <w:rPr>
-            <w:noProof/>
             <w:webHidden/>
           </w:rPr>
           <w:fldChar w:fldCharType="end"/>
@@ -338,10 +302,9 @@
         </w:tabs>
         <w:rPr>
           <w:rFonts w:asciiTheme="minorHAnsi" w:eastAsiaTheme="minorEastAsia" w:hAnsiTheme="minorHAnsi"/>
-          <w:noProof/>
           <w:kern w:val="2"/>
           <w:szCs w:val="30"/>
-          <w:lang w:val="en-MY" w:eastAsia="zh-CN" w:bidi="th-TH"/>
+          <w:lang w:eastAsia="zh-CN" w:bidi="th-TH"/>
           <w14:ligatures w14:val="standardContextual"/>
         </w:rPr>
       </w:pPr>
@@ -349,54 +312,46 @@
         <w:r>
           <w:rPr>
             <w:rStyle w:val="Hyperlink"/>
-            <w:noProof/>
           </w:rPr>
           <w:t>4.1 Target variable</w:t>
         </w:r>
         <w:r>
           <w:rPr>
-            <w:noProof/>
             <w:webHidden/>
           </w:rPr>
           <w:tab/>
         </w:r>
         <w:r>
           <w:rPr>
-            <w:noProof/>
             <w:webHidden/>
           </w:rPr>
           <w:fldChar w:fldCharType="begin"/>
         </w:r>
         <w:r>
           <w:rPr>
-            <w:noProof/>
             <w:webHidden/>
           </w:rPr>
           <w:instrText xml:space="preserve"> PAGEREF _Toc235547032 \h </w:instrText>
         </w:r>
         <w:r>
           <w:rPr>
-            <w:noProof/>
             <w:webHidden/>
           </w:rPr>
         </w:r>
         <w:r>
           <w:rPr>
-            <w:noProof/>
             <w:webHidden/>
           </w:rPr>
           <w:fldChar w:fldCharType="separate"/>
         </w:r>
         <w:r>
           <w:rPr>
-            <w:noProof/>
             <w:webHidden/>
           </w:rPr>
           <w:t>5</w:t>
         </w:r>
         <w:r>
           <w:rPr>
-            <w:noProof/>
             <w:webHidden/>
           </w:rPr>
           <w:fldChar w:fldCharType="end"/>
@@ -411,10 +366,9 @@
         </w:tabs>
         <w:rPr>
           <w:rFonts w:asciiTheme="minorHAnsi" w:eastAsiaTheme="minorEastAsia" w:hAnsiTheme="minorHAnsi"/>
-          <w:noProof/>
           <w:kern w:val="2"/>
           <w:szCs w:val="30"/>
-          <w:lang w:val="en-MY" w:eastAsia="zh-CN" w:bidi="th-TH"/>
+          <w:lang w:eastAsia="zh-CN" w:bidi="th-TH"/>
           <w14:ligatures w14:val="standardContextual"/>
         </w:rPr>
       </w:pPr>
@@ -422,54 +376,46 @@
         <w:r>
           <w:rPr>
             <w:rStyle w:val="Hyperlink"/>
-            <w:noProof/>
           </w:rPr>
           <w:t>4.2 Numerical feature distributions</w:t>
         </w:r>
         <w:r>
           <w:rPr>
-            <w:noProof/>
             <w:webHidden/>
           </w:rPr>
           <w:tab/>
         </w:r>
         <w:r>
           <w:rPr>
-            <w:noProof/>
             <w:webHidden/>
           </w:rPr>
           <w:fldChar w:fldCharType="begin"/>
         </w:r>
         <w:r>
           <w:rPr>
-            <w:noProof/>
             <w:webHidden/>
           </w:rPr>
           <w:instrText xml:space="preserve"> PAGEREF _Toc235547033 \h </w:instrText>
         </w:r>
         <w:r>
           <w:rPr>
-            <w:noProof/>
             <w:webHidden/>
           </w:rPr>
         </w:r>
         <w:r>
           <w:rPr>
-            <w:noProof/>
             <w:webHidden/>
           </w:rPr>
           <w:fldChar w:fldCharType="separate"/>
         </w:r>
         <w:r>
           <w:rPr>
-            <w:noProof/>
             <w:webHidden/>
           </w:rPr>
           <w:t>6</w:t>
         </w:r>
         <w:r>
           <w:rPr>
-            <w:noProof/>
             <w:webHidden/>
           </w:rPr>
           <w:fldChar w:fldCharType="end"/>
@@ -484,10 +430,9 @@
         </w:tabs>
         <w:rPr>
           <w:rFonts w:asciiTheme="minorHAnsi" w:eastAsiaTheme="minorEastAsia" w:hAnsiTheme="minorHAnsi"/>
-          <w:noProof/>
           <w:kern w:val="2"/>
           <w:szCs w:val="30"/>
-          <w:lang w:val="en-MY" w:eastAsia="zh-CN" w:bidi="th-TH"/>
+          <w:lang w:eastAsia="zh-CN" w:bidi="th-TH"/>
           <w14:ligatures w14:val="standardContextual"/>
         </w:rPr>
       </w:pPr>
@@ -495,54 +440,46 @@
         <w:r>
           <w:rPr>
             <w:rStyle w:val="Hyperlink"/>
-            <w:noProof/>
           </w:rPr>
           <w:t>4.3 Categorical features and the target</w:t>
         </w:r>
         <w:r>
           <w:rPr>
-            <w:noProof/>
             <w:webHidden/>
           </w:rPr>
           <w:tab/>
         </w:r>
         <w:r>
           <w:rPr>
-            <w:noProof/>
             <w:webHidden/>
           </w:rPr>
           <w:fldChar w:fldCharType="begin"/>
         </w:r>
         <w:r>
           <w:rPr>
-            <w:noProof/>
             <w:webHidden/>
           </w:rPr>
           <w:instrText xml:space="preserve"> PAGEREF _Toc235547034 \h </w:instrText>
         </w:r>
         <w:r>
           <w:rPr>
-            <w:noProof/>
             <w:webHidden/>
           </w:rPr>
         </w:r>
         <w:r>
           <w:rPr>
-            <w:noProof/>
             <w:webHidden/>
           </w:rPr>
           <w:fldChar w:fldCharType="separate"/>
         </w:r>
         <w:r>
           <w:rPr>
-            <w:noProof/>
             <w:webHidden/>
           </w:rPr>
           <w:t>8</w:t>
         </w:r>
         <w:r>
           <w:rPr>
-            <w:noProof/>
             <w:webHidden/>
           </w:rPr>
           <w:fldChar w:fldCharType="end"/>
@@ -557,10 +494,9 @@
         </w:tabs>
         <w:rPr>
           <w:rFonts w:asciiTheme="minorHAnsi" w:eastAsiaTheme="minorEastAsia" w:hAnsiTheme="minorHAnsi"/>
-          <w:noProof/>
           <w:kern w:val="2"/>
           <w:szCs w:val="30"/>
-          <w:lang w:val="en-MY" w:eastAsia="zh-CN" w:bidi="th-TH"/>
+          <w:lang w:eastAsia="zh-CN" w:bidi="th-TH"/>
           <w14:ligatures w14:val="standardContextual"/>
         </w:rPr>
       </w:pPr>
@@ -568,54 +504,46 @@
         <w:r>
           <w:rPr>
             <w:rStyle w:val="Hyperlink"/>
-            <w:noProof/>
           </w:rPr>
           <w:t>4.4 Correlation and association testing</w:t>
         </w:r>
         <w:r>
           <w:rPr>
-            <w:noProof/>
             <w:webHidden/>
           </w:rPr>
           <w:tab/>
         </w:r>
         <w:r>
           <w:rPr>
-            <w:noProof/>
             <w:webHidden/>
           </w:rPr>
           <w:fldChar w:fldCharType="begin"/>
         </w:r>
         <w:r>
           <w:rPr>
-            <w:noProof/>
             <w:webHidden/>
           </w:rPr>
           <w:instrText xml:space="preserve"> PAGEREF _Toc235547035 \h </w:instrText>
         </w:r>
         <w:r>
           <w:rPr>
-            <w:noProof/>
             <w:webHidden/>
           </w:rPr>
         </w:r>
         <w:r>
           <w:rPr>
-            <w:noProof/>
             <w:webHidden/>
           </w:rPr>
           <w:fldChar w:fldCharType="separate"/>
         </w:r>
         <w:r>
           <w:rPr>
-            <w:noProof/>
             <w:webHidden/>
           </w:rPr>
           <w:t>10</w:t>
         </w:r>
         <w:r>
           <w:rPr>
-            <w:noProof/>
             <w:webHidden/>
           </w:rPr>
           <w:fldChar w:fldCharType="end"/>
@@ -630,10 +558,9 @@
         </w:tabs>
         <w:rPr>
           <w:rFonts w:asciiTheme="minorHAnsi" w:eastAsiaTheme="minorEastAsia" w:hAnsiTheme="minorHAnsi"/>
-          <w:noProof/>
           <w:kern w:val="2"/>
           <w:szCs w:val="30"/>
-          <w:lang w:val="en-MY" w:eastAsia="zh-CN" w:bidi="th-TH"/>
+          <w:lang w:eastAsia="zh-CN" w:bidi="th-TH"/>
           <w14:ligatures w14:val="standardContextual"/>
         </w:rPr>
       </w:pPr>
@@ -641,54 +568,46 @@
         <w:r>
           <w:rPr>
             <w:rStyle w:val="Hyperlink"/>
-            <w:noProof/>
           </w:rPr>
           <w:t>5. Data Preparation</w:t>
         </w:r>
         <w:r>
           <w:rPr>
-            <w:noProof/>
             <w:webHidden/>
           </w:rPr>
           <w:tab/>
         </w:r>
         <w:r>
           <w:rPr>
-            <w:noProof/>
             <w:webHidden/>
           </w:rPr>
           <w:fldChar w:fldCharType="begin"/>
         </w:r>
         <w:r>
           <w:rPr>
-            <w:noProof/>
             <w:webHidden/>
           </w:rPr>
           <w:instrText xml:space="preserve"> PAGEREF _Toc235547036 \h </w:instrText>
         </w:r>
         <w:r>
           <w:rPr>
-            <w:noProof/>
             <w:webHidden/>
           </w:rPr>
         </w:r>
         <w:r>
           <w:rPr>
-            <w:noProof/>
             <w:webHidden/>
           </w:rPr>
           <w:fldChar w:fldCharType="separate"/>
         </w:r>
         <w:r>
           <w:rPr>
-            <w:noProof/>
             <w:webHidden/>
           </w:rPr>
           <w:t>11</w:t>
         </w:r>
         <w:r>
           <w:rPr>
-            <w:noProof/>
             <w:webHidden/>
           </w:rPr>
           <w:fldChar w:fldCharType="end"/>
@@ -703,10 +622,9 @@
         </w:tabs>
         <w:rPr>
           <w:rFonts w:asciiTheme="minorHAnsi" w:eastAsiaTheme="minorEastAsia" w:hAnsiTheme="minorHAnsi"/>
-          <w:noProof/>
           <w:kern w:val="2"/>
           <w:szCs w:val="30"/>
-          <w:lang w:val="en-MY" w:eastAsia="zh-CN" w:bidi="th-TH"/>
+          <w:lang w:eastAsia="zh-CN" w:bidi="th-TH"/>
           <w14:ligatures w14:val="standardContextual"/>
         </w:rPr>
       </w:pPr>
@@ -714,54 +632,46 @@
         <w:r>
           <w:rPr>
             <w:rStyle w:val="Hyperlink"/>
-            <w:noProof/>
           </w:rPr>
           <w:t>6. Data Splitting</w:t>
         </w:r>
         <w:r>
           <w:rPr>
-            <w:noProof/>
             <w:webHidden/>
           </w:rPr>
           <w:tab/>
         </w:r>
         <w:r>
           <w:rPr>
-            <w:noProof/>
             <w:webHidden/>
           </w:rPr>
           <w:fldChar w:fldCharType="begin"/>
         </w:r>
         <w:r>
           <w:rPr>
-            <w:noProof/>
             <w:webHidden/>
           </w:rPr>
           <w:instrText xml:space="preserve"> PAGEREF _Toc235547037 \h </w:instrText>
         </w:r>
         <w:r>
           <w:rPr>
-            <w:noProof/>
             <w:webHidden/>
           </w:rPr>
         </w:r>
         <w:r>
           <w:rPr>
-            <w:noProof/>
             <w:webHidden/>
           </w:rPr>
           <w:fldChar w:fldCharType="separate"/>
         </w:r>
         <w:r>
           <w:rPr>
-            <w:noProof/>
             <w:webHidden/>
           </w:rPr>
           <w:t>12</w:t>
         </w:r>
         <w:r>
           <w:rPr>
-            <w:noProof/>
             <w:webHidden/>
           </w:rPr>
           <w:fldChar w:fldCharType="end"/>
@@ -776,10 +686,9 @@
         </w:tabs>
         <w:rPr>
           <w:rFonts w:asciiTheme="minorHAnsi" w:eastAsiaTheme="minorEastAsia" w:hAnsiTheme="minorHAnsi"/>
-          <w:noProof/>
           <w:kern w:val="2"/>
           <w:szCs w:val="30"/>
-          <w:lang w:val="en-MY" w:eastAsia="zh-CN" w:bidi="th-TH"/>
+          <w:lang w:eastAsia="zh-CN" w:bidi="th-TH"/>
           <w14:ligatures w14:val="standardContextual"/>
         </w:rPr>
       </w:pPr>
@@ -787,54 +696,46 @@
         <w:r>
           <w:rPr>
             <w:rStyle w:val="Hyperlink"/>
-            <w:noProof/>
           </w:rPr>
           <w:t>7. AI Algorithm: Naive Bayes</w:t>
         </w:r>
         <w:r>
           <w:rPr>
-            <w:noProof/>
             <w:webHidden/>
           </w:rPr>
           <w:tab/>
         </w:r>
         <w:r>
           <w:rPr>
-            <w:noProof/>
             <w:webHidden/>
           </w:rPr>
           <w:fldChar w:fldCharType="begin"/>
         </w:r>
         <w:r>
           <w:rPr>
-            <w:noProof/>
             <w:webHidden/>
           </w:rPr>
           <w:instrText xml:space="preserve"> PAGEREF _Toc235547038 \h </w:instrText>
         </w:r>
         <w:r>
           <w:rPr>
-            <w:noProof/>
             <w:webHidden/>
           </w:rPr>
         </w:r>
         <w:r>
           <w:rPr>
-            <w:noProof/>
             <w:webHidden/>
           </w:rPr>
           <w:fldChar w:fldCharType="separate"/>
         </w:r>
         <w:r>
           <w:rPr>
-            <w:noProof/>
             <w:webHidden/>
           </w:rPr>
           <w:t>12</w:t>
         </w:r>
         <w:r>
           <w:rPr>
-            <w:noProof/>
             <w:webHidden/>
           </w:rPr>
           <w:fldChar w:fldCharType="end"/>
@@ -849,10 +750,9 @@
         </w:tabs>
         <w:rPr>
           <w:rFonts w:asciiTheme="minorHAnsi" w:eastAsiaTheme="minorEastAsia" w:hAnsiTheme="minorHAnsi"/>
-          <w:noProof/>
           <w:kern w:val="2"/>
           <w:szCs w:val="30"/>
-          <w:lang w:val="en-MY" w:eastAsia="zh-CN" w:bidi="th-TH"/>
+          <w:lang w:eastAsia="zh-CN" w:bidi="th-TH"/>
           <w14:ligatures w14:val="standardContextual"/>
         </w:rPr>
       </w:pPr>
@@ -860,54 +760,46 @@
         <w:r>
           <w:rPr>
             <w:rStyle w:val="Hyperlink"/>
-            <w:noProof/>
           </w:rPr>
           <w:t>7.1 Why Naive Bayes</w:t>
         </w:r>
         <w:r>
           <w:rPr>
-            <w:noProof/>
             <w:webHidden/>
           </w:rPr>
           <w:tab/>
         </w:r>
         <w:r>
           <w:rPr>
-            <w:noProof/>
             <w:webHidden/>
           </w:rPr>
           <w:fldChar w:fldCharType="begin"/>
         </w:r>
         <w:r>
           <w:rPr>
-            <w:noProof/>
             <w:webHidden/>
           </w:rPr>
           <w:instrText xml:space="preserve"> PAGEREF _Toc235547039 \h </w:instrText>
         </w:r>
         <w:r>
           <w:rPr>
-            <w:noProof/>
             <w:webHidden/>
           </w:rPr>
         </w:r>
         <w:r>
           <w:rPr>
-            <w:noProof/>
             <w:webHidden/>
           </w:rPr>
           <w:fldChar w:fldCharType="separate"/>
         </w:r>
         <w:r>
           <w:rPr>
-            <w:noProof/>
             <w:webHidden/>
           </w:rPr>
           <w:t>12</w:t>
         </w:r>
         <w:r>
           <w:rPr>
-            <w:noProof/>
             <w:webHidden/>
           </w:rPr>
           <w:fldChar w:fldCharType="end"/>
@@ -922,10 +814,9 @@
         </w:tabs>
         <w:rPr>
           <w:rFonts w:asciiTheme="minorHAnsi" w:eastAsiaTheme="minorEastAsia" w:hAnsiTheme="minorHAnsi"/>
-          <w:noProof/>
           <w:kern w:val="2"/>
           <w:szCs w:val="30"/>
-          <w:lang w:val="en-MY" w:eastAsia="zh-CN" w:bidi="th-TH"/>
+          <w:lang w:eastAsia="zh-CN" w:bidi="th-TH"/>
           <w14:ligatures w14:val="standardContextual"/>
         </w:rPr>
       </w:pPr>
@@ -933,54 +824,46 @@
         <w:r>
           <w:rPr>
             <w:rStyle w:val="Hyperlink"/>
-            <w:noProof/>
           </w:rPr>
           <w:t>7.2 Model variants and hyperparameter tuning</w:t>
         </w:r>
         <w:r>
           <w:rPr>
-            <w:noProof/>
             <w:webHidden/>
           </w:rPr>
           <w:tab/>
         </w:r>
         <w:r>
           <w:rPr>
-            <w:noProof/>
             <w:webHidden/>
           </w:rPr>
           <w:fldChar w:fldCharType="begin"/>
         </w:r>
         <w:r>
           <w:rPr>
-            <w:noProof/>
             <w:webHidden/>
           </w:rPr>
           <w:instrText xml:space="preserve"> PAGEREF _Toc235547040 \h </w:instrText>
         </w:r>
         <w:r>
           <w:rPr>
-            <w:noProof/>
             <w:webHidden/>
           </w:rPr>
         </w:r>
         <w:r>
           <w:rPr>
-            <w:noProof/>
             <w:webHidden/>
           </w:rPr>
           <w:fldChar w:fldCharType="separate"/>
         </w:r>
         <w:r>
           <w:rPr>
-            <w:noProof/>
             <w:webHidden/>
           </w:rPr>
           <w:t>13</w:t>
         </w:r>
         <w:r>
           <w:rPr>
-            <w:noProof/>
             <w:webHidden/>
           </w:rPr>
           <w:fldChar w:fldCharType="end"/>
@@ -995,10 +878,9 @@
         </w:tabs>
         <w:rPr>
           <w:rFonts w:asciiTheme="minorHAnsi" w:eastAsiaTheme="minorEastAsia" w:hAnsiTheme="minorHAnsi"/>
-          <w:noProof/>
           <w:kern w:val="2"/>
           <w:szCs w:val="30"/>
-          <w:lang w:val="en-MY" w:eastAsia="zh-CN" w:bidi="th-TH"/>
+          <w:lang w:eastAsia="zh-CN" w:bidi="th-TH"/>
           <w14:ligatures w14:val="standardContextual"/>
         </w:rPr>
       </w:pPr>
@@ -1006,54 +888,46 @@
         <w:r>
           <w:rPr>
             <w:rStyle w:val="Hyperlink"/>
-            <w:noProof/>
           </w:rPr>
           <w:t>8. Performance Evaluation</w:t>
         </w:r>
         <w:r>
           <w:rPr>
-            <w:noProof/>
             <w:webHidden/>
           </w:rPr>
           <w:tab/>
         </w:r>
         <w:r>
           <w:rPr>
-            <w:noProof/>
             <w:webHidden/>
           </w:rPr>
           <w:fldChar w:fldCharType="begin"/>
         </w:r>
         <w:r>
           <w:rPr>
-            <w:noProof/>
             <w:webHidden/>
           </w:rPr>
           <w:instrText xml:space="preserve"> PAGEREF _Toc235547041 \h </w:instrText>
         </w:r>
         <w:r>
           <w:rPr>
-            <w:noProof/>
             <w:webHidden/>
           </w:rPr>
         </w:r>
         <w:r>
           <w:rPr>
-            <w:noProof/>
             <w:webHidden/>
           </w:rPr>
           <w:fldChar w:fldCharType="separate"/>
         </w:r>
         <w:r>
           <w:rPr>
-            <w:noProof/>
             <w:webHidden/>
           </w:rPr>
           <w:t>14</w:t>
         </w:r>
         <w:r>
           <w:rPr>
-            <w:noProof/>
             <w:webHidden/>
           </w:rPr>
           <w:fldChar w:fldCharType="end"/>
@@ -1068,10 +942,9 @@
         </w:tabs>
         <w:rPr>
           <w:rFonts w:asciiTheme="minorHAnsi" w:eastAsiaTheme="minorEastAsia" w:hAnsiTheme="minorHAnsi"/>
-          <w:noProof/>
           <w:kern w:val="2"/>
           <w:szCs w:val="30"/>
-          <w:lang w:val="en-MY" w:eastAsia="zh-CN" w:bidi="th-TH"/>
+          <w:lang w:eastAsia="zh-CN" w:bidi="th-TH"/>
           <w14:ligatures w14:val="standardContextual"/>
         </w:rPr>
       </w:pPr>
@@ -1079,54 +952,46 @@
         <w:r>
           <w:rPr>
             <w:rStyle w:val="Hyperlink"/>
-            <w:noProof/>
           </w:rPr>
           <w:t>8.1 Results</w:t>
         </w:r>
         <w:r>
           <w:rPr>
-            <w:noProof/>
             <w:webHidden/>
           </w:rPr>
           <w:tab/>
         </w:r>
         <w:r>
           <w:rPr>
-            <w:noProof/>
             <w:webHidden/>
           </w:rPr>
           <w:fldChar w:fldCharType="begin"/>
         </w:r>
         <w:r>
           <w:rPr>
-            <w:noProof/>
             <w:webHidden/>
           </w:rPr>
           <w:instrText xml:space="preserve"> PAGEREF _Toc235547042 \h </w:instrText>
         </w:r>
         <w:r>
           <w:rPr>
-            <w:noProof/>
             <w:webHidden/>
           </w:rPr>
         </w:r>
         <w:r>
           <w:rPr>
-            <w:noProof/>
             <w:webHidden/>
           </w:rPr>
           <w:fldChar w:fldCharType="separate"/>
         </w:r>
         <w:r>
           <w:rPr>
-            <w:noProof/>
             <w:webHidden/>
           </w:rPr>
           <w:t>14</w:t>
         </w:r>
         <w:r>
           <w:rPr>
-            <w:noProof/>
             <w:webHidden/>
           </w:rPr>
           <w:fldChar w:fldCharType="end"/>
@@ -1141,10 +1006,9 @@
         </w:tabs>
         <w:rPr>
           <w:rFonts w:asciiTheme="minorHAnsi" w:eastAsiaTheme="minorEastAsia" w:hAnsiTheme="minorHAnsi"/>
-          <w:noProof/>
           <w:kern w:val="2"/>
           <w:szCs w:val="30"/>
-          <w:lang w:val="en-MY" w:eastAsia="zh-CN" w:bidi="th-TH"/>
+          <w:lang w:eastAsia="zh-CN" w:bidi="th-TH"/>
           <w14:ligatures w14:val="standardContextual"/>
         </w:rPr>
       </w:pPr>
@@ -1152,54 +1016,46 @@
         <w:r>
           <w:rPr>
             <w:rStyle w:val="Hyperlink"/>
-            <w:noProof/>
           </w:rPr>
           <w:t>8.2 Interpretation</w:t>
         </w:r>
         <w:r>
           <w:rPr>
-            <w:noProof/>
             <w:webHidden/>
           </w:rPr>
           <w:tab/>
         </w:r>
         <w:r>
           <w:rPr>
-            <w:noProof/>
             <w:webHidden/>
           </w:rPr>
           <w:fldChar w:fldCharType="begin"/>
         </w:r>
         <w:r>
           <w:rPr>
-            <w:noProof/>
             <w:webHidden/>
           </w:rPr>
           <w:instrText xml:space="preserve"> PAGEREF _Toc235547043 \h </w:instrText>
         </w:r>
         <w:r>
           <w:rPr>
-            <w:noProof/>
             <w:webHidden/>
           </w:rPr>
         </w:r>
         <w:r>
           <w:rPr>
-            <w:noProof/>
             <w:webHidden/>
           </w:rPr>
           <w:fldChar w:fldCharType="separate"/>
         </w:r>
         <w:r>
           <w:rPr>
-            <w:noProof/>
             <w:webHidden/>
           </w:rPr>
           <w:t>15</w:t>
         </w:r>
         <w:r>
           <w:rPr>
-            <w:noProof/>
             <w:webHidden/>
           </w:rPr>
           <w:fldChar w:fldCharType="end"/>
@@ -1214,10 +1070,9 @@
         </w:tabs>
         <w:rPr>
           <w:rFonts w:asciiTheme="minorHAnsi" w:eastAsiaTheme="minorEastAsia" w:hAnsiTheme="minorHAnsi"/>
-          <w:noProof/>
           <w:kern w:val="2"/>
           <w:szCs w:val="30"/>
-          <w:lang w:val="en-MY" w:eastAsia="zh-CN" w:bidi="th-TH"/>
+          <w:lang w:eastAsia="zh-CN" w:bidi="th-TH"/>
           <w14:ligatures w14:val="standardContextual"/>
         </w:rPr>
       </w:pPr>
@@ -1225,54 +1080,46 @@
         <w:r>
           <w:rPr>
             <w:rStyle w:val="Hyperlink"/>
-            <w:noProof/>
           </w:rPr>
           <w:t>9. Results (Notebook Evidence)</w:t>
         </w:r>
         <w:r>
           <w:rPr>
-            <w:noProof/>
             <w:webHidden/>
           </w:rPr>
           <w:tab/>
         </w:r>
         <w:r>
           <w:rPr>
-            <w:noProof/>
             <w:webHidden/>
           </w:rPr>
           <w:fldChar w:fldCharType="begin"/>
         </w:r>
         <w:r>
           <w:rPr>
-            <w:noProof/>
             <w:webHidden/>
           </w:rPr>
           <w:instrText xml:space="preserve"> PAGEREF _Toc235547044 \h </w:instrText>
         </w:r>
         <w:r>
           <w:rPr>
-            <w:noProof/>
             <w:webHidden/>
           </w:rPr>
         </w:r>
         <w:r>
           <w:rPr>
-            <w:noProof/>
             <w:webHidden/>
           </w:rPr>
           <w:fldChar w:fldCharType="separate"/>
         </w:r>
         <w:r>
           <w:rPr>
-            <w:noProof/>
             <w:webHidden/>
           </w:rPr>
           <w:t>16</w:t>
         </w:r>
         <w:r>
           <w:rPr>
-            <w:noProof/>
             <w:webHidden/>
           </w:rPr>
           <w:fldChar w:fldCharType="end"/>
@@ -1287,10 +1134,9 @@
         </w:tabs>
         <w:rPr>
           <w:rFonts w:asciiTheme="minorHAnsi" w:eastAsiaTheme="minorEastAsia" w:hAnsiTheme="minorHAnsi"/>
-          <w:noProof/>
           <w:kern w:val="2"/>
           <w:szCs w:val="30"/>
-          <w:lang w:val="en-MY" w:eastAsia="zh-CN" w:bidi="th-TH"/>
+          <w:lang w:eastAsia="zh-CN" w:bidi="th-TH"/>
           <w14:ligatures w14:val="standardContextual"/>
         </w:rPr>
       </w:pPr>
@@ -1298,54 +1144,46 @@
         <w:r>
           <w:rPr>
             <w:rStyle w:val="Hyperlink"/>
-            <w:noProof/>
           </w:rPr>
           <w:t>10. Ethical, Social and Future Implications</w:t>
         </w:r>
         <w:r>
           <w:rPr>
-            <w:noProof/>
             <w:webHidden/>
           </w:rPr>
           <w:tab/>
         </w:r>
         <w:r>
           <w:rPr>
-            <w:noProof/>
             <w:webHidden/>
           </w:rPr>
           <w:fldChar w:fldCharType="begin"/>
         </w:r>
         <w:r>
           <w:rPr>
-            <w:noProof/>
             <w:webHidden/>
           </w:rPr>
           <w:instrText xml:space="preserve"> PAGEREF _Toc235547045 \h </w:instrText>
         </w:r>
         <w:r>
           <w:rPr>
-            <w:noProof/>
             <w:webHidden/>
           </w:rPr>
         </w:r>
         <w:r>
           <w:rPr>
-            <w:noProof/>
             <w:webHidden/>
           </w:rPr>
           <w:fldChar w:fldCharType="separate"/>
         </w:r>
         <w:r>
           <w:rPr>
-            <w:noProof/>
             <w:webHidden/>
           </w:rPr>
           <w:t>24</w:t>
         </w:r>
         <w:r>
           <w:rPr>
-            <w:noProof/>
             <w:webHidden/>
           </w:rPr>
           <w:fldChar w:fldCharType="end"/>
@@ -1360,10 +1198,9 @@
         </w:tabs>
         <w:rPr>
           <w:rFonts w:asciiTheme="minorHAnsi" w:eastAsiaTheme="minorEastAsia" w:hAnsiTheme="minorHAnsi"/>
-          <w:noProof/>
           <w:kern w:val="2"/>
           <w:szCs w:val="30"/>
-          <w:lang w:val="en-MY" w:eastAsia="zh-CN" w:bidi="th-TH"/>
+          <w:lang w:eastAsia="zh-CN" w:bidi="th-TH"/>
           <w14:ligatures w14:val="standardContextual"/>
         </w:rPr>
       </w:pPr>
@@ -1371,54 +1208,46 @@
         <w:r>
           <w:rPr>
             <w:rStyle w:val="Hyperlink"/>
-            <w:noProof/>
           </w:rPr>
           <w:t>11. Conclusion</w:t>
         </w:r>
         <w:r>
           <w:rPr>
-            <w:noProof/>
             <w:webHidden/>
           </w:rPr>
           <w:tab/>
         </w:r>
         <w:r>
           <w:rPr>
-            <w:noProof/>
             <w:webHidden/>
           </w:rPr>
           <w:fldChar w:fldCharType="begin"/>
         </w:r>
         <w:r>
           <w:rPr>
-            <w:noProof/>
             <w:webHidden/>
           </w:rPr>
           <w:instrText xml:space="preserve"> PAGEREF _Toc235547046 \h </w:instrText>
         </w:r>
         <w:r>
           <w:rPr>
-            <w:noProof/>
             <w:webHidden/>
           </w:rPr>
         </w:r>
         <w:r>
           <w:rPr>
-            <w:noProof/>
             <w:webHidden/>
           </w:rPr>
           <w:fldChar w:fldCharType="separate"/>
         </w:r>
         <w:r>
           <w:rPr>
-            <w:noProof/>
             <w:webHidden/>
           </w:rPr>
           <w:t>25</w:t>
         </w:r>
         <w:r>
           <w:rPr>
-            <w:noProof/>
             <w:webHidden/>
           </w:rPr>
           <w:fldChar w:fldCharType="end"/>
@@ -1433,10 +1262,9 @@
         </w:tabs>
         <w:rPr>
           <w:rFonts w:asciiTheme="minorHAnsi" w:eastAsiaTheme="minorEastAsia" w:hAnsiTheme="minorHAnsi"/>
-          <w:noProof/>
           <w:kern w:val="2"/>
           <w:szCs w:val="30"/>
-          <w:lang w:val="en-MY" w:eastAsia="zh-CN" w:bidi="th-TH"/>
+          <w:lang w:eastAsia="zh-CN" w:bidi="th-TH"/>
           <w14:ligatures w14:val="standardContextual"/>
         </w:rPr>
       </w:pPr>
@@ -1444,54 +1272,46 @@
         <w:r>
           <w:rPr>
             <w:rStyle w:val="Hyperlink"/>
-            <w:noProof/>
           </w:rPr>
           <w:t>Marking Rubric (BCS102 Marking Scheme - Semester 2, 2026)</w:t>
         </w:r>
         <w:r>
           <w:rPr>
-            <w:noProof/>
             <w:webHidden/>
           </w:rPr>
           <w:tab/>
         </w:r>
         <w:r>
           <w:rPr>
-            <w:noProof/>
             <w:webHidden/>
           </w:rPr>
           <w:fldChar w:fldCharType="begin"/>
         </w:r>
         <w:r>
           <w:rPr>
-            <w:noProof/>
             <w:webHidden/>
           </w:rPr>
           <w:instrText xml:space="preserve"> PAGEREF _Toc235547047 \h </w:instrText>
         </w:r>
         <w:r>
           <w:rPr>
-            <w:noProof/>
             <w:webHidden/>
           </w:rPr>
         </w:r>
         <w:r>
           <w:rPr>
-            <w:noProof/>
             <w:webHidden/>
           </w:rPr>
           <w:fldChar w:fldCharType="separate"/>
         </w:r>
         <w:r>
           <w:rPr>
-            <w:noProof/>
             <w:webHidden/>
           </w:rPr>
           <w:t>27</w:t>
         </w:r>
         <w:r>
           <w:rPr>
-            <w:noProof/>
             <w:webHidden/>
           </w:rPr>
           <w:fldChar w:fldCharType="end"/>
@@ -1520,87 +1340,350 @@
       <w:bookmarkEnd w:id="0"/>
     </w:p>
     <w:p>
-      <w:r>
-        <w:t>Artificial intelligence (AI) is increasingly embedded in healthcare workflows, from triage support to diagnostic prediction, and its adoption raises questions of accuracy, transparency and ethics in equal measure (</w:t>
-      </w:r>
-      <w:proofErr w:type="spellStart"/>
-      <w:r>
-        <w:t>Tilala</w:t>
-      </w:r>
-      <w:proofErr w:type="spellEnd"/>
-      <w:r>
-        <w:t xml:space="preserve"> et al., 2024). This report documents an end-to-end machine learning workflow applied to the healthcare domain: a public hospital-records dataset is loaded into a Python notebook, explored and </w:t>
-      </w:r>
-      <w:proofErr w:type="spellStart"/>
-      <w:r>
-        <w:t>visualised</w:t>
-      </w:r>
-      <w:proofErr w:type="spellEnd"/>
-      <w:r>
-        <w:t>, prepared and transformed, and used to train and evaluate a Naive Bayes classifier that predicts the outcome of a patient's medical test (Normal, Abnormal or Inconclusive).</w:t>
-      </w:r>
+      <w:pPr>
+        <w:rPr>
+          <w:rFonts w:cs="Times New Roman"/>
+          <w:szCs w:val="24"/>
+        </w:rPr>
+      </w:pPr>
     </w:p>
     <w:p>
-      <w:r>
-        <w:t xml:space="preserve">The report follows the assignment's marking rubric in structure. Section 2 describes the dataset and its features; Sections 3 and 4 cover exploration and </w:t>
+      <w:pPr>
+        <w:rPr>
+          <w:rFonts w:cs="Times New Roman"/>
+          <w:szCs w:val="24"/>
+        </w:rPr>
+      </w:pPr>
+      <w:r>
+        <w:rPr>
+          <w:rFonts w:cs="Times New Roman"/>
+          <w:szCs w:val="24"/>
+        </w:rPr>
+        <w:t>Artificial intelligence (AI) is increasingly being integrated into healthcare workflows, ranging from triage support to diagnostic prediction, raising concerns about accuracy, transparency, and ethics (</w:t>
       </w:r>
       <w:proofErr w:type="spellStart"/>
       <w:r>
-        <w:t>visualisation</w:t>
+        <w:rPr>
+          <w:rFonts w:cs="Times New Roman"/>
+          <w:szCs w:val="24"/>
+        </w:rPr>
+        <w:t>Tilala</w:t>
       </w:r>
       <w:proofErr w:type="spellEnd"/>
       <w:r>
-        <w:t>; Sections 5 and 6 explain preparation and splitting; Section 7 justifies and trains the algorithm; Section 8 evaluates it against suitable performance indicators; Section 9 presents consolidated notebook screenshots as evidence for the pipeline; and Section 10 discusses ethical, social and future implications. A central and deliberately honest finding runs through the report: the trained models perform at the level of random guessing, and we show statistically that this reflects the information content of the dataset itself rather than a modelling error - a result that carries important lessons for real clinical deployment.</w:t>
+        <w:rPr>
+          <w:rFonts w:cs="Times New Roman"/>
+          <w:szCs w:val="24"/>
+        </w:rPr>
+        <w:t xml:space="preserve"> et al., 2024). This report describes an end-to-end machine learning workflow used in the healthcare industry. It involves loading a dataset of medical records from a public hospital into a Python notebook, </w:t>
+      </w:r>
+      <w:proofErr w:type="spellStart"/>
+      <w:r>
+        <w:rPr>
+          <w:rFonts w:cs="Times New Roman"/>
+          <w:szCs w:val="24"/>
+        </w:rPr>
+        <w:t>analyzing</w:t>
+      </w:r>
+      <w:proofErr w:type="spellEnd"/>
+      <w:r>
+        <w:rPr>
+          <w:rFonts w:cs="Times New Roman"/>
+          <w:szCs w:val="24"/>
+        </w:rPr>
+        <w:t xml:space="preserve"> and visualizing the data, preprocessing and transforming the data, and using the data to train and evaluate a Naive Bayes classifier to predict the results of patients' tests (normal, abnormal, or inconclusive).</w:t>
       </w:r>
     </w:p>
     <w:p>
       <w:pPr>
+        <w:rPr>
+          <w:rFonts w:cs="Times New Roman"/>
+          <w:szCs w:val="24"/>
+        </w:rPr>
+      </w:pPr>
+    </w:p>
+    <w:p>
+      <w:pPr>
+        <w:rPr>
+          <w:rFonts w:cs="Times New Roman"/>
+          <w:szCs w:val="24"/>
+        </w:rPr>
+      </w:pPr>
+      <w:bookmarkStart w:id="1" w:name="_Toc235547029"/>
+      <w:r>
+        <w:rPr>
+          <w:rFonts w:cs="Times New Roman"/>
+          <w:szCs w:val="24"/>
+        </w:rPr>
+        <w:t xml:space="preserve">This report's format aligns to the assignment's grading criteria, with Section 2 outlining the dataset's characteristics. Sections 3 and 4 discuss exploration and visualization. Data splitting and preprocessing are described in Sections 5 and 6. The reasoning behind the algorithm's design and its training are described in Section 7. In Section 8, the model is assessed using suitable performance metrics. Consolidated notebook screenshots are shown in Section 9 as evidence of the data processing process. The ethical, social, and future implications are covered in Section 10. The report contains central and deliberate objective findings. The trained models perform at the level of random guessing and show statistical results. This reflects the dataset's information content rather than a </w:t>
+      </w:r>
+      <w:proofErr w:type="spellStart"/>
+      <w:r>
+        <w:rPr>
+          <w:rFonts w:cs="Times New Roman"/>
+          <w:szCs w:val="24"/>
+        </w:rPr>
+        <w:t>modeling</w:t>
+      </w:r>
+      <w:proofErr w:type="spellEnd"/>
+      <w:r>
+        <w:rPr>
+          <w:rFonts w:cs="Times New Roman"/>
+          <w:szCs w:val="24"/>
+        </w:rPr>
+        <w:t xml:space="preserve"> error. This finding provides valuable information for useful clinical applications.</w:t>
+      </w:r>
+    </w:p>
+    <w:p>
+      <w:pPr>
+        <w:rPr>
+          <w:rFonts w:cs="Times New Roman"/>
+          <w:b/>
+          <w:bCs/>
+          <w:szCs w:val="24"/>
+        </w:rPr>
+      </w:pPr>
+    </w:p>
+    <w:p>
+      <w:pPr>
+        <w:spacing w:line="276" w:lineRule="auto"/>
+        <w:rPr>
+          <w:rFonts w:eastAsiaTheme="majorEastAsia" w:cs="Times New Roman"/>
+          <w:b/>
+          <w:bCs/>
+          <w:color w:val="000000"/>
+          <w:szCs w:val="24"/>
+        </w:rPr>
+      </w:pPr>
+      <w:r>
+        <w:br w:type="page"/>
+      </w:r>
+    </w:p>
+    <w:p>
+      <w:pPr>
         <w:pStyle w:val="Heading1"/>
       </w:pPr>
-      <w:bookmarkStart w:id="1" w:name="_Toc235547029"/>
-      <w:r>
+      <w:r>
+        <w:lastRenderedPageBreak/>
         <w:t>2. Dataset Description and Collection</w:t>
       </w:r>
       <w:bookmarkEnd w:id="1"/>
     </w:p>
+    <w:p/>
     <w:p>
-      <w:r>
-        <w:t xml:space="preserve">The dataset chosen is the Healthcare Dataset published on Kaggle by the user prasad22 (kaggle.com/datasets/prasad22/healthcare-dataset). It is a synthetically generated collection of hospital admission records designed to resemble real patient data while containing no real patient information. The raw file was downloaded from Kaggle as a single CSV file (healthcare_dataset.csv) and loaded into a </w:t>
-      </w:r>
-      <w:proofErr w:type="gramStart"/>
-      <w:r>
-        <w:t xml:space="preserve">pandas </w:t>
+      <w:pPr>
+        <w:rPr>
+          <w:rFonts w:cs="Times New Roman"/>
+          <w:szCs w:val="24"/>
+        </w:rPr>
+      </w:pPr>
+      <w:r>
+        <w:rPr>
+          <w:rFonts w:cs="Times New Roman"/>
+          <w:szCs w:val="24"/>
+        </w:rPr>
+        <w:t xml:space="preserve">The </w:t>
+      </w:r>
+      <w:r>
+        <w:rPr>
+          <w:rFonts w:cs="Times New Roman"/>
+          <w:szCs w:val="24"/>
+        </w:rPr>
+        <w:t>data set</w:t>
+      </w:r>
+      <w:r>
+        <w:rPr>
+          <w:rFonts w:cs="Times New Roman"/>
+          <w:szCs w:val="24"/>
+        </w:rPr>
+        <w:t xml:space="preserve"> chosen is the Healthcare Dataset published on Kaggle by </w:t>
+      </w:r>
+      <w:r>
+        <w:rPr>
+          <w:rFonts w:cs="Times New Roman"/>
+          <w:szCs w:val="24"/>
+        </w:rPr>
+        <w:t>Prasad Patil with user id prasad22 (Patil, 2024)</w:t>
+      </w:r>
+      <w:r>
+        <w:rPr>
+          <w:rFonts w:cs="Times New Roman"/>
+          <w:szCs w:val="24"/>
+        </w:rPr>
+        <w:t xml:space="preserve">. </w:t>
+      </w:r>
+      <w:r>
+        <w:rPr>
+          <w:rFonts w:cs="Times New Roman"/>
+          <w:szCs w:val="24"/>
+        </w:rPr>
+        <w:t xml:space="preserve">This synthetic healthcare dataset simulates real-world healthcare data, to practice, develop and demonstrate data processing and analysis skills within the context of the healthcare domain. </w:t>
+      </w:r>
+      <w:r>
+        <w:rPr>
+          <w:rFonts w:cs="Times New Roman"/>
+          <w:szCs w:val="24"/>
+        </w:rPr>
+        <w:t>The raw file was downloaded from Kaggle as a single CSV file</w:t>
+      </w:r>
+      <w:r>
+        <w:rPr>
+          <w:rFonts w:cs="Times New Roman"/>
+          <w:szCs w:val="24"/>
+        </w:rPr>
+        <w:t xml:space="preserve"> named </w:t>
+      </w:r>
+      <w:r>
+        <w:rPr>
+          <w:rFonts w:cs="Times New Roman"/>
+          <w:szCs w:val="24"/>
+        </w:rPr>
+        <w:t xml:space="preserve">healthcare_dataset.csv and loaded into a </w:t>
+      </w:r>
+      <w:r>
+        <w:rPr>
+          <w:rFonts w:cs="Times New Roman"/>
+          <w:szCs w:val="24"/>
+        </w:rPr>
+        <w:t xml:space="preserve">panda </w:t>
       </w:r>
       <w:proofErr w:type="spellStart"/>
       <w:r>
+        <w:rPr>
+          <w:rFonts w:cs="Times New Roman"/>
+          <w:szCs w:val="24"/>
+        </w:rPr>
         <w:t>DataFrame</w:t>
       </w:r>
       <w:proofErr w:type="spellEnd"/>
-      <w:proofErr w:type="gramEnd"/>
-      <w:r>
-        <w:t>. The raw data contains 55,500 observations and 15 features, comfortably exceeding the assignment's minimum scale of 1,000 observations.</w:t>
+      <w:r>
+        <w:rPr>
+          <w:rFonts w:cs="Times New Roman"/>
+          <w:szCs w:val="24"/>
+        </w:rPr>
+        <w:t>. The raw data contains 55500 observations and 15 features</w:t>
+      </w:r>
+      <w:r>
+        <w:rPr>
+          <w:rFonts w:cs="Times New Roman"/>
+          <w:szCs w:val="24"/>
+        </w:rPr>
+        <w:t>, including age, gender, blood type, medical conditional and others. This data set meets</w:t>
+      </w:r>
+      <w:r>
+        <w:rPr>
+          <w:rFonts w:cs="Times New Roman"/>
+          <w:szCs w:val="24"/>
+        </w:rPr>
+        <w:t xml:space="preserve"> the assignment's minimum scale of 1000 observations.</w:t>
       </w:r>
     </w:p>
     <w:p>
-      <w:r>
-        <w:t xml:space="preserve">The collection and processing pipeline was deliberately simple and reproducible. The CSV was placed alongside the notebook and read with pandas' </w:t>
-      </w:r>
-      <w:proofErr w:type="spellStart"/>
-      <w:r>
-        <w:t>read_csv</w:t>
-      </w:r>
-      <w:proofErr w:type="spellEnd"/>
-      <w:r>
-        <w:t xml:space="preserve"> function; no records were excluded at load time. Processing then followed a fixed order - type conversion, renaming, de-duplication, exploration, feature engineering, encoding, scaling and splitting - with each step </w:t>
-      </w:r>
-      <w:r>
-        <w:lastRenderedPageBreak/>
-        <w:t>performed in its own notebook cell and its effect printed immediately, so every transformation of the data is visible and auditable. Analysis combined visual methods (histograms, count plots, boxplots and a correlation heatmap, reproduced as figures in Section 4) with formal statistical tests (ANOVA and chi-square-based Cramer's V), ensuring conclusions rest on numbers as well as pictures. Re-running the notebook top to bottom regenerates every figure and statistic reported here without manual intervention.</w:t>
-      </w:r>
+      <w:pPr>
+        <w:rPr>
+          <w:rFonts w:cs="Times New Roman"/>
+          <w:szCs w:val="24"/>
+        </w:rPr>
+      </w:pPr>
     </w:p>
     <w:p>
-      <w:r>
-        <w:t>Table 1 lists every feature. Fourteen are raw features shipped with the dataset; one additional engineered feature, Length of Stay, is derived during preparation (Section 5) as the number of days between admission and discharge, capturing treatment duration in a single numeric column.</w:t>
+      <w:pPr>
+        <w:rPr>
+          <w:rFonts w:cs="Times New Roman"/>
+          <w:szCs w:val="24"/>
+        </w:rPr>
+      </w:pPr>
+      <w:r>
+        <w:rPr>
+          <w:rFonts w:cs="Times New Roman"/>
+          <w:szCs w:val="24"/>
+        </w:rPr>
+        <w:t xml:space="preserve">The collection and processing pipeline was deliberately simple and reproducible. The CSV was stored alongside the notebook and read using pandas' </w:t>
+      </w:r>
+      <w:proofErr w:type="spellStart"/>
+      <w:r>
+        <w:rPr>
+          <w:rFonts w:cs="Times New Roman"/>
+          <w:szCs w:val="24"/>
+        </w:rPr>
+        <w:t>read_csv</w:t>
+      </w:r>
+      <w:proofErr w:type="spellEnd"/>
+      <w:r>
+        <w:rPr>
+          <w:rFonts w:cs="Times New Roman"/>
+          <w:szCs w:val="24"/>
+        </w:rPr>
+        <w:t xml:space="preserve"> function. At the time of loading, no records were excluded. The processing was then carried out in the following order: type conversion, renaming, de-duplication, exploration, feature engineering, encoding, scaling, and splitting. Each step was completed in a separate notebook </w:t>
+      </w:r>
+      <w:proofErr w:type="gramStart"/>
+      <w:r>
+        <w:rPr>
+          <w:rFonts w:cs="Times New Roman"/>
+          <w:szCs w:val="24"/>
+        </w:rPr>
+        <w:t>cell</w:t>
+      </w:r>
+      <w:proofErr w:type="gramEnd"/>
+      <w:r>
+        <w:rPr>
+          <w:rFonts w:cs="Times New Roman"/>
+          <w:szCs w:val="24"/>
+        </w:rPr>
+        <w:t xml:space="preserve"> and the results were printed instantly, making every data transformation visible and auditable. Visual methods such as histograms, count plots, boxplots, and a correlation heatmap (reproduced as figures in Section 4) were combined with formal statistical tests (ANOVA and chi-square-based Cramer's V), ensuring that conclusions were supported by both numbers and images. Every figure and statistic presented here can be generated without manual intervention by rerunning the notebook from top to bottom.</w:t>
+      </w:r>
+    </w:p>
+    <w:p>
+      <w:pPr>
+        <w:rPr>
+          <w:rFonts w:cs="Times New Roman"/>
+          <w:szCs w:val="24"/>
+        </w:rPr>
+      </w:pPr>
+    </w:p>
+    <w:p>
+      <w:pPr>
+        <w:rPr>
+          <w:rFonts w:cs="Times New Roman"/>
+          <w:szCs w:val="24"/>
+        </w:rPr>
+      </w:pPr>
+      <w:r>
+        <w:rPr>
+          <w:rFonts w:cs="Times New Roman"/>
+          <w:szCs w:val="24"/>
+        </w:rPr>
+        <w:t>All fifteen features in the dataset are shown in Table 1 below</w:t>
+      </w:r>
+      <w:r>
+        <w:rPr>
+          <w:rFonts w:cs="Times New Roman"/>
+          <w:szCs w:val="24"/>
+        </w:rPr>
+        <w:t xml:space="preserve">. </w:t>
+      </w:r>
+      <w:r>
+        <w:rPr>
+          <w:rFonts w:cs="Times New Roman"/>
+          <w:szCs w:val="24"/>
+        </w:rPr>
+        <w:t>Fourteen raw features are included with the dataset. One additional engineered feature, Length of Stay is derived during preparation at Section 5, represents the number of days between admission and discharge, capturing treatment duration with a single numeric column.</w:t>
+      </w:r>
+    </w:p>
+    <w:p>
+      <w:pPr>
+        <w:spacing w:line="276" w:lineRule="auto"/>
+        <w:rPr>
+          <w:rFonts w:cs="Times New Roman"/>
+          <w:szCs w:val="24"/>
+        </w:rPr>
+      </w:pPr>
+      <w:r>
+        <w:rPr>
+          <w:rFonts w:cs="Times New Roman"/>
+          <w:szCs w:val="24"/>
+        </w:rPr>
+        <w:br w:type="page"/>
       </w:r>
     </w:p>
     <w:p>
@@ -1608,6 +1691,7 @@
         <w:rPr>
           <w:i/>
         </w:rPr>
+        <w:lastRenderedPageBreak/>
         <w:t>Table 1. Features of the healthcare dataset.</w:t>
       </w:r>
     </w:p>
@@ -1618,15 +1702,18 @@
         <w:tblLook w:val="04A0" w:firstRow="1" w:lastRow="0" w:firstColumn="1" w:lastColumn="0" w:noHBand="0" w:noVBand="1"/>
       </w:tblPr>
       <w:tblGrid>
-        <w:gridCol w:w="2340"/>
-        <w:gridCol w:w="2340"/>
-        <w:gridCol w:w="2340"/>
-        <w:gridCol w:w="2340"/>
+        <w:gridCol w:w="675"/>
+        <w:gridCol w:w="3261"/>
+        <w:gridCol w:w="2268"/>
+        <w:gridCol w:w="3156"/>
       </w:tblGrid>
       <w:tr>
+        <w:trPr>
+          <w:cantSplit/>
+        </w:trPr>
         <w:tc>
           <w:tcPr>
-            <w:tcW w:w="2340" w:type="dxa"/>
+            <w:tcW w:w="675" w:type="dxa"/>
           </w:tcPr>
           <w:p>
             <w:pPr>
@@ -1643,7 +1730,7 @@
         </w:tc>
         <w:tc>
           <w:tcPr>
-            <w:tcW w:w="2340" w:type="dxa"/>
+            <w:tcW w:w="3261" w:type="dxa"/>
           </w:tcPr>
           <w:p>
             <w:pPr>
@@ -1660,7 +1747,7 @@
         </w:tc>
         <w:tc>
           <w:tcPr>
-            <w:tcW w:w="2340" w:type="dxa"/>
+            <w:tcW w:w="2268" w:type="dxa"/>
           </w:tcPr>
           <w:p>
             <w:pPr>
@@ -1677,7 +1764,7 @@
         </w:tc>
         <w:tc>
           <w:tcPr>
-            <w:tcW w:w="2340" w:type="dxa"/>
+            <w:tcW w:w="3156" w:type="dxa"/>
           </w:tcPr>
           <w:p>
             <w:pPr>
@@ -1694,9 +1781,12 @@
         </w:tc>
       </w:tr>
       <w:tr>
+        <w:trPr>
+          <w:cantSplit/>
+        </w:trPr>
         <w:tc>
           <w:tcPr>
-            <w:tcW w:w="2340" w:type="dxa"/>
+            <w:tcW w:w="675" w:type="dxa"/>
           </w:tcPr>
           <w:p>
             <w:pPr>
@@ -1712,7 +1802,7 @@
         </w:tc>
         <w:tc>
           <w:tcPr>
-            <w:tcW w:w="2340" w:type="dxa"/>
+            <w:tcW w:w="3261" w:type="dxa"/>
           </w:tcPr>
           <w:p>
             <w:pPr>
@@ -1728,7 +1818,7 @@
         </w:tc>
         <w:tc>
           <w:tcPr>
-            <w:tcW w:w="2340" w:type="dxa"/>
+            <w:tcW w:w="2268" w:type="dxa"/>
           </w:tcPr>
           <w:p>
             <w:pPr>
@@ -1744,7 +1834,7 @@
         </w:tc>
         <w:tc>
           <w:tcPr>
-            <w:tcW w:w="2340" w:type="dxa"/>
+            <w:tcW w:w="3156" w:type="dxa"/>
           </w:tcPr>
           <w:p>
             <w:pPr>
@@ -1760,9 +1850,12 @@
         </w:tc>
       </w:tr>
       <w:tr>
+        <w:trPr>
+          <w:cantSplit/>
+        </w:trPr>
         <w:tc>
           <w:tcPr>
-            <w:tcW w:w="2340" w:type="dxa"/>
+            <w:tcW w:w="675" w:type="dxa"/>
           </w:tcPr>
           <w:p>
             <w:pPr>
@@ -1778,7 +1871,7 @@
         </w:tc>
         <w:tc>
           <w:tcPr>
-            <w:tcW w:w="2340" w:type="dxa"/>
+            <w:tcW w:w="3261" w:type="dxa"/>
           </w:tcPr>
           <w:p>
             <w:pPr>
@@ -1794,7 +1887,7 @@
         </w:tc>
         <w:tc>
           <w:tcPr>
-            <w:tcW w:w="2340" w:type="dxa"/>
+            <w:tcW w:w="2268" w:type="dxa"/>
           </w:tcPr>
           <w:p>
             <w:pPr>
@@ -1810,7 +1903,7 @@
         </w:tc>
         <w:tc>
           <w:tcPr>
-            <w:tcW w:w="2340" w:type="dxa"/>
+            <w:tcW w:w="3156" w:type="dxa"/>
           </w:tcPr>
           <w:p>
             <w:pPr>
@@ -1826,9 +1919,12 @@
         </w:tc>
       </w:tr>
       <w:tr>
+        <w:trPr>
+          <w:cantSplit/>
+        </w:trPr>
         <w:tc>
           <w:tcPr>
-            <w:tcW w:w="2340" w:type="dxa"/>
+            <w:tcW w:w="675" w:type="dxa"/>
           </w:tcPr>
           <w:p>
             <w:pPr>
@@ -1844,7 +1940,7 @@
         </w:tc>
         <w:tc>
           <w:tcPr>
-            <w:tcW w:w="2340" w:type="dxa"/>
+            <w:tcW w:w="3261" w:type="dxa"/>
           </w:tcPr>
           <w:p>
             <w:pPr>
@@ -1860,7 +1956,7 @@
         </w:tc>
         <w:tc>
           <w:tcPr>
-            <w:tcW w:w="2340" w:type="dxa"/>
+            <w:tcW w:w="2268" w:type="dxa"/>
           </w:tcPr>
           <w:p>
             <w:pPr>
@@ -1876,7 +1972,7 @@
         </w:tc>
         <w:tc>
           <w:tcPr>
-            <w:tcW w:w="2340" w:type="dxa"/>
+            <w:tcW w:w="3156" w:type="dxa"/>
           </w:tcPr>
           <w:p>
             <w:pPr>
@@ -1892,9 +1988,12 @@
         </w:tc>
       </w:tr>
       <w:tr>
+        <w:trPr>
+          <w:cantSplit/>
+        </w:trPr>
         <w:tc>
           <w:tcPr>
-            <w:tcW w:w="2340" w:type="dxa"/>
+            <w:tcW w:w="675" w:type="dxa"/>
           </w:tcPr>
           <w:p>
             <w:pPr>
@@ -1910,7 +2009,7 @@
         </w:tc>
         <w:tc>
           <w:tcPr>
-            <w:tcW w:w="2340" w:type="dxa"/>
+            <w:tcW w:w="3261" w:type="dxa"/>
           </w:tcPr>
           <w:p>
             <w:pPr>
@@ -1926,7 +2025,7 @@
         </w:tc>
         <w:tc>
           <w:tcPr>
-            <w:tcW w:w="2340" w:type="dxa"/>
+            <w:tcW w:w="2268" w:type="dxa"/>
           </w:tcPr>
           <w:p>
             <w:pPr>
@@ -1942,7 +2041,7 @@
         </w:tc>
         <w:tc>
           <w:tcPr>
-            <w:tcW w:w="2340" w:type="dxa"/>
+            <w:tcW w:w="3156" w:type="dxa"/>
           </w:tcPr>
           <w:p>
             <w:pPr>
@@ -1958,9 +2057,12 @@
         </w:tc>
       </w:tr>
       <w:tr>
+        <w:trPr>
+          <w:cantSplit/>
+        </w:trPr>
         <w:tc>
           <w:tcPr>
-            <w:tcW w:w="2340" w:type="dxa"/>
+            <w:tcW w:w="675" w:type="dxa"/>
           </w:tcPr>
           <w:p>
             <w:pPr>
@@ -1976,7 +2078,7 @@
         </w:tc>
         <w:tc>
           <w:tcPr>
-            <w:tcW w:w="2340" w:type="dxa"/>
+            <w:tcW w:w="3261" w:type="dxa"/>
           </w:tcPr>
           <w:p>
             <w:pPr>
@@ -1992,7 +2094,7 @@
         </w:tc>
         <w:tc>
           <w:tcPr>
-            <w:tcW w:w="2340" w:type="dxa"/>
+            <w:tcW w:w="2268" w:type="dxa"/>
           </w:tcPr>
           <w:p>
             <w:pPr>
@@ -2008,7 +2110,7 @@
         </w:tc>
         <w:tc>
           <w:tcPr>
-            <w:tcW w:w="2340" w:type="dxa"/>
+            <w:tcW w:w="3156" w:type="dxa"/>
           </w:tcPr>
           <w:p>
             <w:pPr>
@@ -2024,9 +2126,12 @@
         </w:tc>
       </w:tr>
       <w:tr>
+        <w:trPr>
+          <w:cantSplit/>
+        </w:trPr>
         <w:tc>
           <w:tcPr>
-            <w:tcW w:w="2340" w:type="dxa"/>
+            <w:tcW w:w="675" w:type="dxa"/>
           </w:tcPr>
           <w:p>
             <w:pPr>
@@ -2042,7 +2147,7 @@
         </w:tc>
         <w:tc>
           <w:tcPr>
-            <w:tcW w:w="2340" w:type="dxa"/>
+            <w:tcW w:w="3261" w:type="dxa"/>
           </w:tcPr>
           <w:p>
             <w:pPr>
@@ -2058,7 +2163,7 @@
         </w:tc>
         <w:tc>
           <w:tcPr>
-            <w:tcW w:w="2340" w:type="dxa"/>
+            <w:tcW w:w="2268" w:type="dxa"/>
           </w:tcPr>
           <w:p>
             <w:pPr>
@@ -2074,7 +2179,7 @@
         </w:tc>
         <w:tc>
           <w:tcPr>
-            <w:tcW w:w="2340" w:type="dxa"/>
+            <w:tcW w:w="3156" w:type="dxa"/>
           </w:tcPr>
           <w:p>
             <w:pPr>
@@ -2090,9 +2195,12 @@
         </w:tc>
       </w:tr>
       <w:tr>
+        <w:trPr>
+          <w:cantSplit/>
+        </w:trPr>
         <w:tc>
           <w:tcPr>
-            <w:tcW w:w="2340" w:type="dxa"/>
+            <w:tcW w:w="675" w:type="dxa"/>
           </w:tcPr>
           <w:p>
             <w:pPr>
@@ -2108,7 +2216,7 @@
         </w:tc>
         <w:tc>
           <w:tcPr>
-            <w:tcW w:w="2340" w:type="dxa"/>
+            <w:tcW w:w="3261" w:type="dxa"/>
           </w:tcPr>
           <w:p>
             <w:pPr>
@@ -2124,7 +2232,7 @@
         </w:tc>
         <w:tc>
           <w:tcPr>
-            <w:tcW w:w="2340" w:type="dxa"/>
+            <w:tcW w:w="2268" w:type="dxa"/>
           </w:tcPr>
           <w:p>
             <w:pPr>
@@ -2140,7 +2248,7 @@
         </w:tc>
         <w:tc>
           <w:tcPr>
-            <w:tcW w:w="2340" w:type="dxa"/>
+            <w:tcW w:w="3156" w:type="dxa"/>
           </w:tcPr>
           <w:p>
             <w:pPr>
@@ -2156,9 +2264,12 @@
         </w:tc>
       </w:tr>
       <w:tr>
+        <w:trPr>
+          <w:cantSplit/>
+        </w:trPr>
         <w:tc>
           <w:tcPr>
-            <w:tcW w:w="2340" w:type="dxa"/>
+            <w:tcW w:w="675" w:type="dxa"/>
           </w:tcPr>
           <w:p>
             <w:pPr>
@@ -2174,7 +2285,7 @@
         </w:tc>
         <w:tc>
           <w:tcPr>
-            <w:tcW w:w="2340" w:type="dxa"/>
+            <w:tcW w:w="3261" w:type="dxa"/>
           </w:tcPr>
           <w:p>
             <w:pPr>
@@ -2190,7 +2301,7 @@
         </w:tc>
         <w:tc>
           <w:tcPr>
-            <w:tcW w:w="2340" w:type="dxa"/>
+            <w:tcW w:w="2268" w:type="dxa"/>
           </w:tcPr>
           <w:p>
             <w:pPr>
@@ -2206,7 +2317,7 @@
         </w:tc>
         <w:tc>
           <w:tcPr>
-            <w:tcW w:w="2340" w:type="dxa"/>
+            <w:tcW w:w="3156" w:type="dxa"/>
           </w:tcPr>
           <w:p>
             <w:pPr>
@@ -2222,9 +2333,12 @@
         </w:tc>
       </w:tr>
       <w:tr>
+        <w:trPr>
+          <w:cantSplit/>
+        </w:trPr>
         <w:tc>
           <w:tcPr>
-            <w:tcW w:w="2340" w:type="dxa"/>
+            <w:tcW w:w="675" w:type="dxa"/>
           </w:tcPr>
           <w:p>
             <w:pPr>
@@ -2240,7 +2354,7 @@
         </w:tc>
         <w:tc>
           <w:tcPr>
-            <w:tcW w:w="2340" w:type="dxa"/>
+            <w:tcW w:w="3261" w:type="dxa"/>
           </w:tcPr>
           <w:p>
             <w:pPr>
@@ -2256,7 +2370,7 @@
         </w:tc>
         <w:tc>
           <w:tcPr>
-            <w:tcW w:w="2340" w:type="dxa"/>
+            <w:tcW w:w="2268" w:type="dxa"/>
           </w:tcPr>
           <w:p>
             <w:pPr>
@@ -2272,7 +2386,7 @@
         </w:tc>
         <w:tc>
           <w:tcPr>
-            <w:tcW w:w="2340" w:type="dxa"/>
+            <w:tcW w:w="3156" w:type="dxa"/>
           </w:tcPr>
           <w:p>
             <w:pPr>
@@ -2288,9 +2402,12 @@
         </w:tc>
       </w:tr>
       <w:tr>
+        <w:trPr>
+          <w:cantSplit/>
+        </w:trPr>
         <w:tc>
           <w:tcPr>
-            <w:tcW w:w="2340" w:type="dxa"/>
+            <w:tcW w:w="675" w:type="dxa"/>
           </w:tcPr>
           <w:p>
             <w:pPr>
@@ -2306,7 +2423,7 @@
         </w:tc>
         <w:tc>
           <w:tcPr>
-            <w:tcW w:w="2340" w:type="dxa"/>
+            <w:tcW w:w="3261" w:type="dxa"/>
           </w:tcPr>
           <w:p>
             <w:pPr>
@@ -2322,7 +2439,7 @@
         </w:tc>
         <w:tc>
           <w:tcPr>
-            <w:tcW w:w="2340" w:type="dxa"/>
+            <w:tcW w:w="2268" w:type="dxa"/>
           </w:tcPr>
           <w:p>
             <w:pPr>
@@ -2338,7 +2455,7 @@
         </w:tc>
         <w:tc>
           <w:tcPr>
-            <w:tcW w:w="2340" w:type="dxa"/>
+            <w:tcW w:w="3156" w:type="dxa"/>
           </w:tcPr>
           <w:p>
             <w:pPr>
@@ -2354,9 +2471,12 @@
         </w:tc>
       </w:tr>
       <w:tr>
+        <w:trPr>
+          <w:cantSplit/>
+        </w:trPr>
         <w:tc>
           <w:tcPr>
-            <w:tcW w:w="2340" w:type="dxa"/>
+            <w:tcW w:w="675" w:type="dxa"/>
           </w:tcPr>
           <w:p>
             <w:pPr>
@@ -2372,7 +2492,7 @@
         </w:tc>
         <w:tc>
           <w:tcPr>
-            <w:tcW w:w="2340" w:type="dxa"/>
+            <w:tcW w:w="3261" w:type="dxa"/>
           </w:tcPr>
           <w:p>
             <w:pPr>
@@ -2388,7 +2508,7 @@
         </w:tc>
         <w:tc>
           <w:tcPr>
-            <w:tcW w:w="2340" w:type="dxa"/>
+            <w:tcW w:w="2268" w:type="dxa"/>
           </w:tcPr>
           <w:p>
             <w:pPr>
@@ -2404,7 +2524,7 @@
         </w:tc>
         <w:tc>
           <w:tcPr>
-            <w:tcW w:w="2340" w:type="dxa"/>
+            <w:tcW w:w="3156" w:type="dxa"/>
           </w:tcPr>
           <w:p>
             <w:pPr>
@@ -2420,9 +2540,12 @@
         </w:tc>
       </w:tr>
       <w:tr>
+        <w:trPr>
+          <w:cantSplit/>
+        </w:trPr>
         <w:tc>
           <w:tcPr>
-            <w:tcW w:w="2340" w:type="dxa"/>
+            <w:tcW w:w="675" w:type="dxa"/>
           </w:tcPr>
           <w:p>
             <w:pPr>
@@ -2438,7 +2561,7 @@
         </w:tc>
         <w:tc>
           <w:tcPr>
-            <w:tcW w:w="2340" w:type="dxa"/>
+            <w:tcW w:w="3261" w:type="dxa"/>
           </w:tcPr>
           <w:p>
             <w:pPr>
@@ -2454,7 +2577,7 @@
         </w:tc>
         <w:tc>
           <w:tcPr>
-            <w:tcW w:w="2340" w:type="dxa"/>
+            <w:tcW w:w="2268" w:type="dxa"/>
           </w:tcPr>
           <w:p>
             <w:pPr>
@@ -2470,7 +2593,7 @@
         </w:tc>
         <w:tc>
           <w:tcPr>
-            <w:tcW w:w="2340" w:type="dxa"/>
+            <w:tcW w:w="3156" w:type="dxa"/>
           </w:tcPr>
           <w:p>
             <w:pPr>
@@ -2486,9 +2609,12 @@
         </w:tc>
       </w:tr>
       <w:tr>
+        <w:trPr>
+          <w:cantSplit/>
+        </w:trPr>
         <w:tc>
           <w:tcPr>
-            <w:tcW w:w="2340" w:type="dxa"/>
+            <w:tcW w:w="675" w:type="dxa"/>
           </w:tcPr>
           <w:p>
             <w:pPr>
@@ -2504,7 +2630,7 @@
         </w:tc>
         <w:tc>
           <w:tcPr>
-            <w:tcW w:w="2340" w:type="dxa"/>
+            <w:tcW w:w="3261" w:type="dxa"/>
           </w:tcPr>
           <w:p>
             <w:pPr>
@@ -2520,7 +2646,7 @@
         </w:tc>
         <w:tc>
           <w:tcPr>
-            <w:tcW w:w="2340" w:type="dxa"/>
+            <w:tcW w:w="2268" w:type="dxa"/>
           </w:tcPr>
           <w:p>
             <w:pPr>
@@ -2536,7 +2662,7 @@
         </w:tc>
         <w:tc>
           <w:tcPr>
-            <w:tcW w:w="2340" w:type="dxa"/>
+            <w:tcW w:w="3156" w:type="dxa"/>
           </w:tcPr>
           <w:p>
             <w:pPr>
@@ -2552,9 +2678,12 @@
         </w:tc>
       </w:tr>
       <w:tr>
+        <w:trPr>
+          <w:cantSplit/>
+        </w:trPr>
         <w:tc>
           <w:tcPr>
-            <w:tcW w:w="2340" w:type="dxa"/>
+            <w:tcW w:w="675" w:type="dxa"/>
           </w:tcPr>
           <w:p>
             <w:pPr>
@@ -2570,7 +2699,7 @@
         </w:tc>
         <w:tc>
           <w:tcPr>
-            <w:tcW w:w="2340" w:type="dxa"/>
+            <w:tcW w:w="3261" w:type="dxa"/>
           </w:tcPr>
           <w:p>
             <w:pPr>
@@ -2586,7 +2715,7 @@
         </w:tc>
         <w:tc>
           <w:tcPr>
-            <w:tcW w:w="2340" w:type="dxa"/>
+            <w:tcW w:w="2268" w:type="dxa"/>
           </w:tcPr>
           <w:p>
             <w:pPr>
@@ -2602,7 +2731,7 @@
         </w:tc>
         <w:tc>
           <w:tcPr>
-            <w:tcW w:w="2340" w:type="dxa"/>
+            <w:tcW w:w="3156" w:type="dxa"/>
           </w:tcPr>
           <w:p>
             <w:pPr>
@@ -2618,9 +2747,12 @@
         </w:tc>
       </w:tr>
       <w:tr>
+        <w:trPr>
+          <w:cantSplit/>
+        </w:trPr>
         <w:tc>
           <w:tcPr>
-            <w:tcW w:w="2340" w:type="dxa"/>
+            <w:tcW w:w="675" w:type="dxa"/>
           </w:tcPr>
           <w:p>
             <w:pPr>
@@ -2636,7 +2768,7 @@
         </w:tc>
         <w:tc>
           <w:tcPr>
-            <w:tcW w:w="2340" w:type="dxa"/>
+            <w:tcW w:w="3261" w:type="dxa"/>
           </w:tcPr>
           <w:p>
             <w:pPr>
@@ -2652,7 +2784,7 @@
         </w:tc>
         <w:tc>
           <w:tcPr>
-            <w:tcW w:w="2340" w:type="dxa"/>
+            <w:tcW w:w="2268" w:type="dxa"/>
           </w:tcPr>
           <w:p>
             <w:pPr>
@@ -2668,7 +2800,7 @@
         </w:tc>
         <w:tc>
           <w:tcPr>
-            <w:tcW w:w="2340" w:type="dxa"/>
+            <w:tcW w:w="3156" w:type="dxa"/>
           </w:tcPr>
           <w:p>
             <w:pPr>
@@ -2678,22 +2810,18 @@
               <w:rPr>
                 <w:sz w:val="21"/>
               </w:rPr>
-              <w:t xml:space="preserve">Normal, Abnormal or </w:t>
-            </w:r>
-            <w:r>
-              <w:rPr>
-                <w:sz w:val="21"/>
-              </w:rPr>
-              <w:lastRenderedPageBreak/>
-              <w:t>Inconclusive</w:t>
+              <w:t>Normal, Abnormal or Inconclusive</w:t>
             </w:r>
           </w:p>
         </w:tc>
       </w:tr>
       <w:tr>
+        <w:trPr>
+          <w:cantSplit/>
+        </w:trPr>
         <w:tc>
           <w:tcPr>
-            <w:tcW w:w="2340" w:type="dxa"/>
+            <w:tcW w:w="675" w:type="dxa"/>
           </w:tcPr>
           <w:p>
             <w:pPr>
@@ -2703,14 +2831,13 @@
               <w:rPr>
                 <w:sz w:val="21"/>
               </w:rPr>
-              <w:lastRenderedPageBreak/>
               <w:t>16</w:t>
             </w:r>
           </w:p>
         </w:tc>
         <w:tc>
           <w:tcPr>
-            <w:tcW w:w="2340" w:type="dxa"/>
+            <w:tcW w:w="3261" w:type="dxa"/>
           </w:tcPr>
           <w:p>
             <w:pPr>
@@ -2726,7 +2853,7 @@
         </w:tc>
         <w:tc>
           <w:tcPr>
-            <w:tcW w:w="2340" w:type="dxa"/>
+            <w:tcW w:w="2268" w:type="dxa"/>
           </w:tcPr>
           <w:p>
             <w:pPr>
@@ -2742,7 +2869,7 @@
         </w:tc>
         <w:tc>
           <w:tcPr>
-            <w:tcW w:w="2340" w:type="dxa"/>
+            <w:tcW w:w="3156" w:type="dxa"/>
           </w:tcPr>
           <w:p>
             <w:pPr>
@@ -2761,17 +2888,34 @@
     <w:p/>
     <w:p>
       <w:pPr>
+        <w:spacing w:line="276" w:lineRule="auto"/>
+        <w:rPr>
+          <w:rFonts w:eastAsiaTheme="majorEastAsia" w:cs="Times New Roman"/>
+          <w:b/>
+          <w:bCs/>
+          <w:color w:val="000000"/>
+          <w:szCs w:val="24"/>
+        </w:rPr>
+      </w:pPr>
+      <w:bookmarkStart w:id="2" w:name="_Toc235547030"/>
+      <w:r>
+        <w:br w:type="page"/>
+      </w:r>
+    </w:p>
+    <w:p>
+      <w:pPr>
         <w:pStyle w:val="Heading1"/>
       </w:pPr>
-      <w:bookmarkStart w:id="2" w:name="_Toc235547030"/>
-      <w:r>
+      <w:r>
+        <w:lastRenderedPageBreak/>
         <w:t>3. Data Exploration</w:t>
       </w:r>
       <w:bookmarkEnd w:id="2"/>
     </w:p>
+    <w:p/>
     <w:p>
       <w:r>
-        <w:t xml:space="preserve">Initial exploration established the dataset's dimensions (55,500 rows by 15 columns) and each feature's data type using </w:t>
+        <w:t xml:space="preserve">The dataset's dimensions were established through initial exploration, with 55,500 rows and 15 columns. The data type of each feature can be determined using </w:t>
       </w:r>
       <w:proofErr w:type="gramStart"/>
       <w:r>
@@ -2789,7 +2933,7 @@
       <w:proofErr w:type="spellEnd"/>
       <w:proofErr w:type="gramEnd"/>
       <w:r>
-        <w:t xml:space="preserve">(). Several types required correction: the two date columns arrived as plain text and were converted to proper datetime64 columns, enabling the date arithmetic used later for feature engineering, and the six nominal fields plus the target were cast to the </w:t>
+        <w:t xml:space="preserve">(). Several types needed to be corrected. The two date columns arrived as plain text and were converted to proper datetime 64 columns, allowing date arithmetic to be used later for feature engineering. The target and the six nominal fields were cast to the </w:t>
       </w:r>
       <w:proofErr w:type="gramStart"/>
       <w:r>
@@ -2805,47 +2949,66 @@
       </w:r>
       <w:proofErr w:type="spellEnd"/>
       <w:r>
-        <w:t>, which is more memory-efficient than generic object storage and makes their semantics explicit.</w:t>
+        <w:t>, which makes their semantics explicit and uses less memory than generic object storage.</w:t>
+      </w:r>
+    </w:p>
+    <w:p/>
+    <w:p>
+      <w:r>
+        <w:t>For the clarity of the data, one of the fields has been renamed. The ‘Name’ column has been changed to ‘Patient Name’, as this dataset contains three separate columns storing names, patient, doctor and hospital. simply labelling it ‘Name’ could lead to misinterpretation</w:t>
+      </w:r>
+      <w:r>
+        <w:t xml:space="preserve">. </w:t>
+      </w:r>
+      <w:r>
+        <w:t xml:space="preserve">Completeness checks showed 534 exact duplicate rows but no missing values in any of the columns. </w:t>
+      </w:r>
+      <w:proofErr w:type="gramStart"/>
+      <w:r>
+        <w:t>In order to</w:t>
+      </w:r>
+      <w:proofErr w:type="gramEnd"/>
+      <w:r>
+        <w:t xml:space="preserve"> prevent duplicates, these were eliminated prior to any additional analysis, leaving 54,966 unique observations. This is because a record that is repeated on both sides of a train/test split allows the model to be assessed on data that it has essentially already seen. </w:t>
+      </w:r>
+      <w:r>
+        <w:t>Therefore, all data and statistics appearing in this report hereafter are based on deduplicated data. Every categorical column was validated against its documented set of valid values in Table 1, confirming that Gender contains exactly {Male, Female} with no unexpected category such as "Other" and no blank or whitespace only entries. This ensures that the data is proven clean, not just assumed to be.</w:t>
       </w:r>
     </w:p>
     <w:p>
-      <w:r>
-        <w:t xml:space="preserve">One feature was renamed for clarity: the column Name became Patient Name, because three separate columns in this dataset hold names (patient, doctor and hospital) and the bare word "Name" invites misreading. Completeness checks found no missing </w:t>
-      </w:r>
-      <w:proofErr w:type="gramStart"/>
-      <w:r>
-        <w:t>values</w:t>
-      </w:r>
-      <w:proofErr w:type="gramEnd"/>
-      <w:r>
-        <w:t xml:space="preserve"> in any </w:t>
-      </w:r>
-      <w:proofErr w:type="gramStart"/>
-      <w:r>
-        <w:t>column, but</w:t>
-      </w:r>
-      <w:proofErr w:type="gramEnd"/>
-      <w:r>
-        <w:t xml:space="preserve"> did find 534 exact-duplicate rows. These were removed before any further analysis, leaving 54,966 unique observations; duplicates matter because a record repeated on both sides of a train/test split lets the model be evaluated on data it has effectively already seen. All subsequent figures and statistics in this report therefore describe the de-duplicated data. Beyond completeness, every categorical column was also validated against its documented set of valid values (Table 1) - confirming, for example, that Gender contains exactly {Male, Female} with no unexpected category such as "Other" and no blank or whitespace-only entries - so the data is proven clean, not just assumed to be.</w:t>
-      </w:r>
+      <w:pPr>
+        <w:pStyle w:val="Heading1"/>
+      </w:pPr>
+      <w:bookmarkStart w:id="3" w:name="_Toc235547031"/>
     </w:p>
     <w:p>
       <w:pPr>
-        <w:pStyle w:val="Heading1"/>
-      </w:pPr>
-      <w:bookmarkStart w:id="3" w:name="_Toc235547031"/>
-      <w:r>
-        <w:t xml:space="preserve">4. Exploratory Data Analysis and </w:t>
-      </w:r>
-      <w:proofErr w:type="spellStart"/>
-      <w:r>
-        <w:t>Visualisation</w:t>
-      </w:r>
-      <w:bookmarkEnd w:id="3"/>
-      <w:proofErr w:type="spellEnd"/>
+        <w:spacing w:after="200" w:line="276" w:lineRule="auto"/>
+        <w:jc w:val="left"/>
+        <w:rPr>
+          <w:rFonts w:eastAsiaTheme="majorEastAsia" w:cs="Times New Roman"/>
+          <w:b/>
+          <w:bCs/>
+          <w:color w:val="000000"/>
+          <w:szCs w:val="24"/>
+        </w:rPr>
+      </w:pPr>
+      <w:r>
+        <w:br w:type="page"/>
+      </w:r>
     </w:p>
     <w:p>
       <w:pPr>
+        <w:pStyle w:val="Heading1"/>
+      </w:pPr>
+      <w:r>
+        <w:lastRenderedPageBreak/>
+        <w:t>4. Exploratory Data Analysis and Visualisation</w:t>
+      </w:r>
+      <w:bookmarkEnd w:id="3"/>
+    </w:p>
+    <w:p>
+      <w:pPr>
         <w:pStyle w:val="Heading2"/>
       </w:pPr>
       <w:bookmarkStart w:id="4" w:name="_Toc235547032"/>
@@ -2854,41 +3017,27 @@
       </w:r>
       <w:bookmarkEnd w:id="4"/>
     </w:p>
+    <w:p/>
     <w:p>
       <w:r>
-        <w:t>Figure 1 shows the distribution of the target. The three classes are almost perfectly balanced: Abnormal 33.5%, Normal 33.3% and Inconclusive 33.1%. This balance has two consequences: accuracy is a fair headline metric (</w:t>
+        <w:t xml:space="preserve">The target's distribution is shown in Figure 1. The three categories Abnormal 33.5%, Normal 33.3%, and Inconclusive 33.1% are nearly evenly distributed. This balance has two consequences, accuracy is a fair headline metric where no majority class can be </w:t>
       </w:r>
       <w:proofErr w:type="gramStart"/>
       <w:r>
-        <w:t>no</w:t>
+        <w:t>manipulated</w:t>
       </w:r>
       <w:proofErr w:type="gramEnd"/>
       <w:r>
-        <w:t xml:space="preserve"> majority class can be gamed), and any model must clearly beat 33.3% accuracy to demonstrate it has learned anything at all.</w:t>
+        <w:t> and any model must clearly outperform 33.3% accuracy to show that it has learned anything at all. </w:t>
       </w:r>
     </w:p>
+    <w:p/>
     <w:p>
       <w:r>
-        <w:lastRenderedPageBreak/>
-        <w:t xml:space="preserve">Because the classes are balanced, no resampling technique such as SMOTE or class weighting is required; each class contributes roughly equal evidence during training. Balance of this quality </w:t>
-      </w:r>
-      <w:proofErr w:type="gramStart"/>
-      <w:r>
-        <w:t>is itself</w:t>
-      </w:r>
-      <w:proofErr w:type="gramEnd"/>
-      <w:r>
-        <w:t xml:space="preserve"> unusual in real clinical data, where abnormal findings are typically the minority - another hint </w:t>
-      </w:r>
-      <w:proofErr w:type="gramStart"/>
-      <w:r>
-        <w:t>that</w:t>
-      </w:r>
-      <w:proofErr w:type="gramEnd"/>
-      <w:r>
-        <w:t xml:space="preserve"> the dataset was generated rather than collected.</w:t>
+        <w:t>Each class contributes about equal amounts of evidence during training, so resampling methods like SMOTE or class weighting are not necessary because the classes are balanced. Since abnormal findings are usually the minority in real clinical data, the balance of this quality is unusual in and of itself. This is another indication that the dataset was created rather than gathered.</w:t>
       </w:r>
     </w:p>
+    <w:p/>
     <w:p>
       <w:pPr>
         <w:jc w:val="center"/>
@@ -2937,6 +3086,9 @@
     <w:p>
       <w:pPr>
         <w:jc w:val="center"/>
+        <w:rPr>
+          <w:i/>
+        </w:rPr>
       </w:pPr>
       <w:r>
         <w:rPr>
@@ -2947,19 +3099,43 @@
     </w:p>
     <w:p>
       <w:pPr>
+        <w:jc w:val="center"/>
+      </w:pPr>
+    </w:p>
+    <w:p>
+      <w:pPr>
+        <w:spacing w:after="200" w:line="276" w:lineRule="auto"/>
+        <w:jc w:val="left"/>
+        <w:rPr>
+          <w:rFonts w:eastAsiaTheme="majorEastAsia" w:cstheme="majorBidi"/>
+          <w:b/>
+          <w:bCs/>
+          <w:color w:val="000000"/>
+          <w:szCs w:val="26"/>
+        </w:rPr>
+      </w:pPr>
+      <w:bookmarkStart w:id="5" w:name="_Toc235547033"/>
+      <w:r>
+        <w:br w:type="page"/>
+      </w:r>
+    </w:p>
+    <w:p>
+      <w:pPr>
         <w:pStyle w:val="Heading2"/>
       </w:pPr>
-      <w:bookmarkStart w:id="5" w:name="_Toc235547033"/>
-      <w:r>
+      <w:r>
+        <w:lastRenderedPageBreak/>
         <w:t>4.2 Numerical feature distributions</w:t>
       </w:r>
       <w:bookmarkEnd w:id="5"/>
     </w:p>
+    <w:p/>
     <w:p>
       <w:r>
-        <w:t>Age (Figure 2) is spread nearly uniformly from the teens to the late eighties, with no peak or skew. Real patient-age distributions typically skew toward older ages, so this flat shape is an early signature of synthetic generation. Billing Amount (Figure 3) is likewise almost uniform across its range, where real billing data is strongly right-skewed by a minority of high-cost cases. Boxplots with the 1.5 x IQR rule (Figure 4) confirm the visual impression quantitatively: zero outliers in either feature across all 54,966 rows.</w:t>
+        <w:t>Figure 2 shows a nearly uniform patient age distribution with no peak or skew, ranging from the teens to the late eighties. This flat shape is an early indicator of synthetic generation because real patient-age distributions tend to skew toward older ages. Billing Amount in Figure 3 is similarly nearly constant throughout its range, although a small percentage of high-cost cases significantly skew real billing data to the right. Boxplots using the 1.5 x IQR rule as shown Figure 4 confirms that the visual impression quantitatively that there are no outliers in either feature across all 54,966 rows.</w:t>
       </w:r>
     </w:p>
+    <w:p/>
     <w:p>
       <w:pPr>
         <w:jc w:val="center"/>
@@ -2968,7 +3144,6 @@
         <w:rPr>
           <w:noProof/>
         </w:rPr>
-        <w:lastRenderedPageBreak/>
         <w:drawing>
           <wp:inline distT="0" distB="0" distL="0" distR="0" wp14:anchorId="7F955765" wp14:editId="1F46CAA2">
             <wp:extent cx="5120640" cy="3176093"/>
@@ -3025,6 +3200,7 @@
         <w:rPr>
           <w:noProof/>
         </w:rPr>
+        <w:lastRenderedPageBreak/>
         <w:drawing>
           <wp:inline distT="0" distB="0" distL="0" distR="0" wp14:anchorId="79D875F3" wp14:editId="0031E7F6">
             <wp:extent cx="5120640" cy="3176093"/>
@@ -3065,6 +3241,9 @@
     <w:p>
       <w:pPr>
         <w:jc w:val="center"/>
+        <w:rPr>
+          <w:i/>
+        </w:rPr>
       </w:pPr>
       <w:r>
         <w:rPr>
@@ -3077,11 +3256,15 @@
       <w:pPr>
         <w:jc w:val="center"/>
       </w:pPr>
+    </w:p>
+    <w:p>
+      <w:pPr>
+        <w:jc w:val="center"/>
+      </w:pPr>
       <w:r>
         <w:rPr>
           <w:noProof/>
         </w:rPr>
-        <w:lastRenderedPageBreak/>
         <w:drawing>
           <wp:inline distT="0" distB="0" distL="0" distR="0" wp14:anchorId="159C8570" wp14:editId="30B7CE97">
             <wp:extent cx="5120640" cy="2112048"/>
@@ -3132,18 +3315,49 @@
     </w:p>
     <w:p>
       <w:pPr>
+        <w:spacing w:after="200" w:line="276" w:lineRule="auto"/>
+        <w:jc w:val="left"/>
+        <w:rPr>
+          <w:rFonts w:eastAsiaTheme="majorEastAsia" w:cstheme="majorBidi"/>
+          <w:b/>
+          <w:bCs/>
+          <w:color w:val="000000"/>
+          <w:szCs w:val="26"/>
+        </w:rPr>
+      </w:pPr>
+      <w:bookmarkStart w:id="6" w:name="_Toc235547034"/>
+      <w:r>
+        <w:br w:type="page"/>
+      </w:r>
+    </w:p>
+    <w:p>
+      <w:pPr>
         <w:pStyle w:val="Heading2"/>
       </w:pPr>
-      <w:bookmarkStart w:id="6" w:name="_Toc235547034"/>
-      <w:r>
+      <w:r>
+        <w:lastRenderedPageBreak/>
         <w:t>4.3 Categorical features and the target</w:t>
       </w:r>
       <w:bookmarkEnd w:id="6"/>
     </w:p>
+    <w:p/>
     <w:p>
       <w:r>
-        <w:t>All six medical conditions appear in near-equal numbers (Figure 5), so the model sees ample examples of each. More telling are Figures 6 and 7: within every medical condition and every admission type, the three test outcomes occur in essentially the same proportions as in the overall data. If test results were genuinely driven by condition or admission context, these bars would shift visibly between groups; their uniformity is the first warning that the features may carry little signal about the target.</w:t>
-      </w:r>
+        <w:t xml:space="preserve">There are six distinct medical conditions in total. As seen in Figure 5, all six medical conditions are present in nearly equal numbers, so the model sees plenty of examples of each. Figures 6 and 7 show that the three test outcomes occur in almost the same proportions across all medical conditions and admission types. These bars would clearly change between groups if test results were </w:t>
+      </w:r>
+      <w:proofErr w:type="gramStart"/>
+      <w:r>
+        <w:t>actually influenced</w:t>
+      </w:r>
+      <w:proofErr w:type="gramEnd"/>
+      <w:r>
+        <w:t xml:space="preserve"> by condition or admission context. Their consistency is the first indication that the features might not provide much information about the target.</w:t>
+      </w:r>
+    </w:p>
+    <w:p>
+      <w:pPr>
+        <w:jc w:val="center"/>
+      </w:pPr>
     </w:p>
     <w:p>
       <w:pPr>
@@ -3198,7 +3412,6 @@
         <w:rPr>
           <w:i/>
         </w:rPr>
-        <w:lastRenderedPageBreak/>
         <w:t>Figure 5. Distribution of medical conditions.</w:t>
       </w:r>
     </w:p>
@@ -3210,6 +3423,7 @@
         <w:rPr>
           <w:noProof/>
         </w:rPr>
+        <w:lastRenderedPageBreak/>
         <w:drawing>
           <wp:inline distT="0" distB="0" distL="0" distR="0" wp14:anchorId="4B9389C6" wp14:editId="76195D59">
             <wp:extent cx="5120640" cy="3054780"/>
@@ -3316,49 +3530,44 @@
     </w:p>
     <w:p>
       <w:pPr>
+        <w:spacing w:after="200" w:line="276" w:lineRule="auto"/>
+        <w:jc w:val="left"/>
+        <w:rPr>
+          <w:rFonts w:eastAsiaTheme="majorEastAsia" w:cstheme="majorBidi"/>
+          <w:b/>
+          <w:bCs/>
+          <w:color w:val="000000"/>
+          <w:szCs w:val="26"/>
+        </w:rPr>
+      </w:pPr>
+      <w:bookmarkStart w:id="7" w:name="_Toc235547035"/>
+      <w:r>
+        <w:br w:type="page"/>
+      </w:r>
+    </w:p>
+    <w:p>
+      <w:pPr>
         <w:pStyle w:val="Heading2"/>
       </w:pPr>
-      <w:bookmarkStart w:id="7" w:name="_Toc235547035"/>
       <w:r>
         <w:lastRenderedPageBreak/>
         <w:t>4.4 Correlation and association testing</w:t>
       </w:r>
       <w:bookmarkEnd w:id="7"/>
     </w:p>
+    <w:p/>
     <w:p>
       <w:r>
-        <w:t xml:space="preserve">Pearson correlations between the numerical features are all near zero (Figure 8), indicating no meaningful linear relationships - incidentally consistent with Naive </w:t>
-      </w:r>
-      <w:proofErr w:type="spellStart"/>
-      <w:r>
-        <w:t>Bayes's</w:t>
-      </w:r>
-      <w:proofErr w:type="spellEnd"/>
-      <w:r>
-        <w:t xml:space="preserve"> conditional independence assumption. Because correlation between features says nothing about association with the target, we tested every feature against Test Results directly: one-way ANOVA F-tests for the numeric features and Cramer's V (derived from chi-square tests) for the categorical ones. Every ANOVA p-value exceeded the 0.05 significance threshold and every Cramer's V was approximately zero. Statistically, no individual feature is measurably associated with the target - a finding that predicts, before any model is trained, that classification performance will be </w:t>
-      </w:r>
-      <w:proofErr w:type="gramStart"/>
-      <w:r>
-        <w:t>bounded</w:t>
-      </w:r>
-      <w:proofErr w:type="gramEnd"/>
-      <w:r>
-        <w:t xml:space="preserve"> near chance level.</w:t>
+        <w:t>The Pearson correlations between the numerical features are all close to zero (Figure 8), indicating that there are no meaningful linear relationships, which is consistent with Naive Bayes' conditional independence assumption. We directly tested each feature against the test results, using one-way ANOVA F-tests for the numerical features and Cramer's V (derived from chi-square tests) for the categorical ones, since correlation between features does not indicate association with the target. Every Cramer's V was close to zero and every ANOVA p-value was higher than the significance level of 0.05. Before any model is trained, it is predicted that classification performance will be bounded near the chance level because no single feature is statistically measurably associated with the target.</w:t>
       </w:r>
     </w:p>
+    <w:p/>
     <w:p>
       <w:r>
-        <w:t xml:space="preserve">Concretely, the ANOVA tests for Age and Billing Amount against the three outcome classes produced p-values well above 0.05, so the per-class means cannot be statistically distinguished from one another. Cramer's V for Gender, Blood Type, Medical Condition, Insurance Provider, Admission Type and Medication all </w:t>
-      </w:r>
-      <w:proofErr w:type="gramStart"/>
-      <w:r>
-        <w:t>fell</w:t>
-      </w:r>
-      <w:proofErr w:type="gramEnd"/>
-      <w:r>
-        <w:t xml:space="preserve"> close to zero on a scale where zero means no association and one means perfect association - values this small leave essentially nothing for any classifier to exploit.</w:t>
+        <w:t>The ANOVA tests for Age and Billing Amount against the three outcome classes yielded p-values well above 0.05, indicating that the per-class means cannot be statistically distinguished from one another. The V-values for Cramer's measures of gender, blood type, medical condition, insurance provider, admission type and medication use were all close to zero. On this scale, zero indicates no association, whilst one indicates a perfect association. Such low values make it difficult for any classifier to extract meaningful information from them.</w:t>
       </w:r>
     </w:p>
+    <w:p/>
     <w:p>
       <w:pPr>
         <w:jc w:val="center"/>
@@ -3368,8 +3577,8 @@
           <w:noProof/>
         </w:rPr>
         <w:drawing>
-          <wp:inline distT="0" distB="0" distL="0" distR="0" wp14:anchorId="75680B79" wp14:editId="338D13D3">
-            <wp:extent cx="5120640" cy="3434833"/>
+          <wp:inline distT="0" distB="0" distL="0" distR="0" wp14:anchorId="75680B79" wp14:editId="06582F7C">
+            <wp:extent cx="4232214" cy="2838893"/>
             <wp:effectExtent l="0" t="0" r="0" b="0"/>
             <wp:docPr id="8" name="Picture 8"/>
             <wp:cNvGraphicFramePr>
@@ -3391,7 +3600,7 @@
                   <pic:spPr>
                     <a:xfrm>
                       <a:off x="0" y="0"/>
-                      <a:ext cx="5120640" cy="3434833"/>
+                      <a:ext cx="4233441" cy="2839716"/>
                     </a:xfrm>
                     <a:prstGeom prst="rect">
                       <a:avLst/>
@@ -3412,7 +3621,6 @@
         <w:rPr>
           <w:i/>
         </w:rPr>
-        <w:lastRenderedPageBreak/>
         <w:t>Figure 8. Correlation heatmap of numerical features.</w:t>
       </w:r>
     </w:p>
@@ -3422,87 +3630,307 @@
       </w:pPr>
       <w:bookmarkStart w:id="8" w:name="_Toc235547036"/>
       <w:r>
+        <w:lastRenderedPageBreak/>
         <w:t>5. Data Preparation</w:t>
       </w:r>
       <w:bookmarkEnd w:id="8"/>
     </w:p>
+    <w:p/>
     <w:p>
-      <w:r>
-        <w:t xml:space="preserve">Preparation proceeded in five steps, each motivated by the requirements of the chosen algorithm. First, cleaning: the duplicate removal and completeness checks described in Section 3. Second, feature extraction: Length of Stay was engineered as the day difference between discharge and admission dates, converting two dates the model cannot use directly into one meaningful duration. Third, dropping non-predictive identifiers: Patient Name, Doctor, Hospital and Room Number identify records rather than describe them, and retaining such high-cardinality identifiers invites </w:t>
-      </w:r>
-      <w:proofErr w:type="spellStart"/>
-      <w:r>
-        <w:t>memorisation</w:t>
-      </w:r>
-      <w:proofErr w:type="spellEnd"/>
-      <w:r>
-        <w:t xml:space="preserve"> instead of learning.</w:t>
+      <w:pPr>
+        <w:rPr>
+          <w:szCs w:val="24"/>
+        </w:rPr>
+      </w:pPr>
+      <w:r>
+        <w:rPr>
+          <w:szCs w:val="24"/>
+        </w:rPr>
+        <w:t>The preparatory work is carried out in five steps, each of which is designed in accordance with the requirements of the selected algorithm.</w:t>
       </w:r>
     </w:p>
     <w:p>
-      <w:r>
-        <w:t xml:space="preserve">Fourth, transformation: the six categorical features and the target were label-encoded into integer codes. Naive Bayes does not require one-hot encoding: </w:t>
-      </w:r>
-      <w:proofErr w:type="spellStart"/>
-      <w:r>
-        <w:t>CategoricalNB</w:t>
-      </w:r>
-      <w:proofErr w:type="spellEnd"/>
-      <w:r>
-        <w:t xml:space="preserve"> models each feature's category distribution per class directly, and no distance metric is computed in which integer codes could imply a false ordering. Fifth, scaling: for the Gaussian variant, the numerical features (Age, Billing Amount, Length of Stay) were </w:t>
-      </w:r>
-      <w:proofErr w:type="spellStart"/>
-      <w:r>
-        <w:t>standardised</w:t>
-      </w:r>
-      <w:proofErr w:type="spellEnd"/>
-      <w:r>
-        <w:t xml:space="preserve"> with </w:t>
-      </w:r>
-      <w:proofErr w:type="spellStart"/>
-      <w:r>
-        <w:t>StandardScaler</w:t>
-      </w:r>
-      <w:proofErr w:type="spellEnd"/>
-      <w:r>
-        <w:t xml:space="preserve"> fitted on the training set only, keeping features on comparable scales for numerical stability. For the categorical variant, the numerical features were instead binned into quintiles, with bin edges learned from the training set and reused unchanged on the test set so that no information about the test distribution leaks into training.</w:t>
-      </w:r>
+      <w:pPr>
+        <w:rPr>
+          <w:szCs w:val="24"/>
+        </w:rPr>
+      </w:pPr>
     </w:p>
     <w:p>
-      <w:r>
-        <w:t xml:space="preserve">Two common preparation steps were considered and deliberately omitted, with reasons. Outlier removal was unnecessary because the IQR screening of Section 4.2 found no outliers to remove; missing-value imputation was unnecessary because the completeness check found no gaps. Documenting these negative checks </w:t>
-      </w:r>
-      <w:proofErr w:type="gramStart"/>
-      <w:r>
-        <w:t>matters</w:t>
-      </w:r>
-      <w:proofErr w:type="gramEnd"/>
-      <w:r>
-        <w:t xml:space="preserve"> as much as performing transformations: it demonstrates each step was evaluated against the data rather than skipped, and it keeps the pipeline as small as the data allows, reducing the risk of introducing artefacts through unneeded processing.</w:t>
+      <w:pPr>
+        <w:pStyle w:val="ListParagraph"/>
+        <w:numPr>
+          <w:ilvl w:val="0"/>
+          <w:numId w:val="10"/>
+        </w:numPr>
+        <w:ind w:left="360"/>
+        <w:rPr>
+          <w:szCs w:val="24"/>
+        </w:rPr>
+      </w:pPr>
+      <w:r>
+        <w:rPr>
+          <w:szCs w:val="24"/>
+        </w:rPr>
+        <w:t>Cleaning</w:t>
       </w:r>
     </w:p>
     <w:p>
       <w:pPr>
+        <w:ind w:left="360"/>
+        <w:rPr>
+          <w:szCs w:val="24"/>
+        </w:rPr>
+      </w:pPr>
+      <w:r>
+        <w:rPr>
+          <w:szCs w:val="24"/>
+        </w:rPr>
+        <w:t>As described in Section 3, the raw data with duplicated data are removed and completeness are checked to ensure that there are no empty or missing values in the data.</w:t>
+      </w:r>
+    </w:p>
+    <w:p>
+      <w:pPr>
+        <w:ind w:left="360"/>
+        <w:rPr>
+          <w:szCs w:val="24"/>
+        </w:rPr>
+      </w:pPr>
+    </w:p>
+    <w:p>
+      <w:pPr>
+        <w:pStyle w:val="ListParagraph"/>
+        <w:numPr>
+          <w:ilvl w:val="0"/>
+          <w:numId w:val="10"/>
+        </w:numPr>
+        <w:ind w:left="360"/>
+        <w:rPr>
+          <w:szCs w:val="24"/>
+        </w:rPr>
+      </w:pPr>
+      <w:r>
+        <w:rPr>
+          <w:szCs w:val="24"/>
+        </w:rPr>
+        <w:t>Feature Extraction</w:t>
+      </w:r>
+    </w:p>
+    <w:p>
+      <w:pPr>
+        <w:pStyle w:val="ListParagraph"/>
+        <w:ind w:left="360"/>
+        <w:rPr>
+          <w:szCs w:val="24"/>
+        </w:rPr>
+      </w:pPr>
+      <w:r>
+        <w:rPr>
+          <w:szCs w:val="24"/>
+        </w:rPr>
+        <w:t xml:space="preserve">Length of Stay was engineered as the day difference between discharge and admission dates, combining two dates that the model cannot use directly into a single meaningful duration. </w:t>
+      </w:r>
+    </w:p>
+    <w:p>
+      <w:pPr>
+        <w:pStyle w:val="ListParagraph"/>
+        <w:ind w:left="360"/>
+        <w:rPr>
+          <w:szCs w:val="24"/>
+        </w:rPr>
+      </w:pPr>
+    </w:p>
+    <w:p>
+      <w:pPr>
+        <w:pStyle w:val="ListParagraph"/>
+        <w:numPr>
+          <w:ilvl w:val="0"/>
+          <w:numId w:val="10"/>
+        </w:numPr>
+        <w:ind w:left="360"/>
+        <w:rPr>
+          <w:szCs w:val="24"/>
+        </w:rPr>
+      </w:pPr>
+      <w:r>
+        <w:rPr>
+          <w:szCs w:val="24"/>
+        </w:rPr>
+        <w:t>Dropping non-predictive identifiers</w:t>
+      </w:r>
+    </w:p>
+    <w:p>
+      <w:pPr>
+        <w:pStyle w:val="ListParagraph"/>
+        <w:ind w:left="360"/>
+        <w:rPr>
+          <w:szCs w:val="24"/>
+        </w:rPr>
+      </w:pPr>
+      <w:r>
+        <w:rPr>
+          <w:szCs w:val="24"/>
+        </w:rPr>
+        <w:t>Retaining high-cardinality identifiers like patient name, doctor, hospital, and room number encourages memorization rather than learning. These identifiers identify records rather than describe them.</w:t>
+      </w:r>
+    </w:p>
+    <w:p>
+      <w:pPr>
+        <w:pStyle w:val="ListParagraph"/>
+        <w:ind w:left="360"/>
+        <w:rPr>
+          <w:szCs w:val="24"/>
+        </w:rPr>
+      </w:pPr>
+    </w:p>
+    <w:p>
+      <w:pPr>
+        <w:pStyle w:val="ListParagraph"/>
+        <w:numPr>
+          <w:ilvl w:val="0"/>
+          <w:numId w:val="10"/>
+        </w:numPr>
+        <w:ind w:left="360"/>
+        <w:rPr>
+          <w:szCs w:val="24"/>
+        </w:rPr>
+      </w:pPr>
+      <w:r>
+        <w:rPr>
+          <w:szCs w:val="24"/>
+        </w:rPr>
+        <w:t>Transformation</w:t>
+      </w:r>
+    </w:p>
+    <w:p>
+      <w:pPr>
+        <w:pStyle w:val="ListParagraph"/>
+        <w:ind w:left="360"/>
+        <w:rPr>
+          <w:szCs w:val="24"/>
+        </w:rPr>
+      </w:pPr>
+      <w:r>
+        <w:rPr>
+          <w:szCs w:val="24"/>
+        </w:rPr>
+        <w:t xml:space="preserve">The target and the six categorical features were label-encoded into integer codes. One-hot encoding is optional for Naive Bayes because </w:t>
+      </w:r>
+      <w:proofErr w:type="spellStart"/>
+      <w:r>
+        <w:rPr>
+          <w:szCs w:val="24"/>
+        </w:rPr>
+        <w:t>CategoricalNB</w:t>
+      </w:r>
+      <w:proofErr w:type="spellEnd"/>
+      <w:r>
+        <w:rPr>
+          <w:szCs w:val="24"/>
+        </w:rPr>
+        <w:t xml:space="preserve"> directly models the category distribution of each feature per class and does not compute any distance metric where integer codes might suggest an incorrect ordering.</w:t>
+      </w:r>
+    </w:p>
+    <w:p>
+      <w:pPr>
+        <w:pStyle w:val="ListParagraph"/>
+        <w:ind w:left="360"/>
+        <w:rPr>
+          <w:szCs w:val="24"/>
+        </w:rPr>
+      </w:pPr>
+    </w:p>
+    <w:p>
+      <w:pPr>
+        <w:pStyle w:val="ListParagraph"/>
+        <w:numPr>
+          <w:ilvl w:val="0"/>
+          <w:numId w:val="10"/>
+        </w:numPr>
+        <w:ind w:left="360"/>
+        <w:rPr>
+          <w:szCs w:val="24"/>
+        </w:rPr>
+      </w:pPr>
+      <w:r>
+        <w:rPr>
+          <w:szCs w:val="24"/>
+        </w:rPr>
+        <w:t>Scaling</w:t>
+      </w:r>
+    </w:p>
+    <w:p>
+      <w:pPr>
+        <w:pStyle w:val="ListParagraph"/>
+        <w:ind w:left="360"/>
+        <w:rPr>
+          <w:szCs w:val="24"/>
+        </w:rPr>
+      </w:pPr>
+      <w:r>
+        <w:rPr>
+          <w:szCs w:val="24"/>
+        </w:rPr>
+        <w:t xml:space="preserve">To maintain numerical stability for the Gaussian variant, the numerical features (Age, Billing Amount, Length of Stay) were standardized using </w:t>
+      </w:r>
+      <w:proofErr w:type="spellStart"/>
+      <w:r>
+        <w:rPr>
+          <w:szCs w:val="24"/>
+        </w:rPr>
+        <w:t>StandardScaler</w:t>
+      </w:r>
+      <w:proofErr w:type="spellEnd"/>
+      <w:r>
+        <w:rPr>
+          <w:szCs w:val="24"/>
+        </w:rPr>
+        <w:t xml:space="preserve"> fitted on the training set exclusively. In the categorical variant, the numerical features were binned into quintiles, with bin edges learned from the training set and reused unchanged on the test set, ensuring that no information about the test distribution leaked into training. Two typical preparation steps were taken into consideration, these have been deliberately omitted, with relevant </w:t>
+      </w:r>
+      <w:r>
+        <w:rPr>
+          <w:szCs w:val="24"/>
+        </w:rPr>
+        <w:lastRenderedPageBreak/>
+        <w:t>explanations provided. Missing-value imputation was not required because the completeness check did not find any gaps. Outlier removal was not required because the IQR screening of Section 4.2 did not find any outliers to remove.</w:t>
+      </w:r>
+    </w:p>
+    <w:p>
+      <w:pPr>
+        <w:pStyle w:val="ListParagraph"/>
+        <w:ind w:left="360"/>
+        <w:rPr>
+          <w:szCs w:val="24"/>
+        </w:rPr>
+      </w:pPr>
+    </w:p>
+    <w:p>
+      <w:bookmarkStart w:id="9" w:name="_Toc235547037"/>
+      <w:r>
+        <w:rPr>
+          <w:szCs w:val="24"/>
+        </w:rPr>
+        <w:t>Documenting these negative checks is just as important as carrying out transformations because it shows that every step was evaluated against the data rather than omitted, and it keeps the pipeline as small as the data allows, minimizing the possibility of introducing artifacts through unnecessary processing.</w:t>
+      </w:r>
+    </w:p>
+    <w:p>
+      <w:r>
+        <w:t xml:space="preserve"> </w:t>
+      </w:r>
+    </w:p>
+    <w:p>
+      <w:pPr>
         <w:pStyle w:val="Heading1"/>
       </w:pPr>
-      <w:bookmarkStart w:id="9" w:name="_Toc235547037"/>
-      <w:r>
-        <w:lastRenderedPageBreak/>
+      <w:r>
         <w:t>6. Data Splitting</w:t>
       </w:r>
       <w:bookmarkEnd w:id="9"/>
     </w:p>
+    <w:p/>
     <w:p>
       <w:r>
-        <w:t xml:space="preserve">The 54,966 prepared observations were divided with a stratified 80/20 holdout split: 43,972 training rows and 10,994 test rows. At this scale a simple holdout gives stable, low-variance estimates of test performance, so k-fold cross-validation was reserved for a different job - hyperparameter selection inside the training set (Section 7) - keeping the test set completely unseen until final evaluation. Stratification on the target preserved class proportions on both sides of the split, and the printed proportions </w:t>
-      </w:r>
-      <w:proofErr w:type="gramStart"/>
-      <w:r>
-        <w:t>confirm</w:t>
-      </w:r>
-      <w:proofErr w:type="gramEnd"/>
-      <w:r>
-        <w:t xml:space="preserve"> it worked: 33.5% / 33.1% / 33.4% in training versus 33.6% / 33.1% / 33.4% in test. A fixed random seed (</w:t>
+        <w:t>A stratified 80/20 holdout split was used to separate the 54,966 prepared observations into 43,972 training rows and 10,994 test rows. Since a straightforward holdout provides stable, low-variance estimates of test performance at this scale, k-fold cross-validation was set aside for a different task, hyperparameter selection within the training set (Section 7) keeping the test set entirely hidden until the final evaluation. Class proportions were maintained on both sides of the split by stratification on the target, and the printed proportions, 33.5% / 33.1% / 33.4% in training versus 33.6% / 33.1% / 33.4% in test confirm that it was successful. A fixed random seed, </w:t>
       </w:r>
       <w:proofErr w:type="spellStart"/>
       <w:r>
@@ -3510,20 +3938,52 @@
       </w:r>
       <w:proofErr w:type="spellEnd"/>
       <w:r>
-        <w:t xml:space="preserve"> = 42) makes the split, and therefore every downstream result, exactly reproducible.</w:t>
+        <w:t xml:space="preserve"> = 42 ensures that the split and all subsequent results are precisely repeatable.</w:t>
+      </w:r>
+    </w:p>
+    <w:p/>
+    <w:p>
+      <w:pPr>
+        <w:rPr>
+          <w:b/>
+          <w:bCs/>
+        </w:rPr>
+      </w:pPr>
+      <w:bookmarkStart w:id="10" w:name="_Toc235547038"/>
+      <w:r>
+        <w:t>Before deciding on the holdout, various splitting strategies were considered. For the final evaluation, repeated k-fold cross-validation would add little precision at this sample size while reusing the same observations across folds at an additional computational cost. Since the target lacks a temporal structure of interest, a time-based split was not appropriate. A smaller test fraction would have increased the uncertainty of the reported metrics. The 80/20 stratified holdout balances training volume against evaluation stability, which is why it is the standard at this scale.</w:t>
       </w:r>
     </w:p>
     <w:p>
-      <w:r>
-        <w:t>Alternative splitting strategies were weighed before settling on the holdout. Repeated k-fold cross-validation for the final evaluation would re-use the same observations across folds at extra compute cost while adding little precision at this sample size; a time-based split was inapplicable because the target has no temporal structure of interest; and a smaller test fraction would have widened the uncertainty of the reported metrics. The 80/20 stratified holdout therefore balances training volume against evaluation stability, which is why it is the conventional default at this scale.</w:t>
+      <w:pPr>
+        <w:rPr>
+          <w:b/>
+          <w:bCs/>
+        </w:rPr>
+      </w:pPr>
+      <w:r>
+        <w:t xml:space="preserve"> </w:t>
       </w:r>
     </w:p>
     <w:p>
       <w:pPr>
+        <w:spacing w:after="200" w:line="276" w:lineRule="auto"/>
+        <w:jc w:val="left"/>
+      </w:pPr>
+      <w:r>
+        <w:rPr>
+          <w:b/>
+          <w:bCs/>
+        </w:rPr>
+        <w:br w:type="page"/>
+      </w:r>
+    </w:p>
+    <w:p>
+      <w:pPr>
         <w:pStyle w:val="Heading1"/>
       </w:pPr>
-      <w:bookmarkStart w:id="10" w:name="_Toc235547038"/>
-      <w:r>
+      <w:r>
+        <w:lastRenderedPageBreak/>
         <w:t>7. AI Algorithm: Naive Bayes</w:t>
       </w:r>
       <w:bookmarkEnd w:id="10"/>
@@ -3545,7 +4005,6 @@
     </w:p>
     <w:p>
       <w:r>
-        <w:lastRenderedPageBreak/>
         <w:t xml:space="preserve">Formally, for a class c and feature vector x, Bayes' theorem gives </w:t>
       </w:r>
       <w:proofErr w:type="gramStart"/>
@@ -3562,39 +4021,23 @@
       </w:r>
       <w:proofErr w:type="gramEnd"/>
       <w:r>
-        <w:t xml:space="preserve">x | c). The prior P(c) is estimated from class frequencies in the training set - here roughly one third per class - and the naive assumption </w:t>
+        <w:t xml:space="preserve">x | c). The prior P(c) is estimated from class frequencies in the training set - here roughly one third per class - and the naive assumption factorises the likelihood </w:t>
+      </w:r>
+      <w:proofErr w:type="gramStart"/>
+      <w:r>
+        <w:t>P(</w:t>
+      </w:r>
+      <w:proofErr w:type="gramEnd"/>
+      <w:r>
+        <w:t xml:space="preserve">x | c) into a product of one term per feature. </w:t>
       </w:r>
       <w:proofErr w:type="spellStart"/>
       <w:r>
-        <w:t>factorises</w:t>
+        <w:t>GaussianNB</w:t>
       </w:r>
       <w:proofErr w:type="spellEnd"/>
       <w:r>
-        <w:t xml:space="preserve"> the likelihood </w:t>
-      </w:r>
-      <w:proofErr w:type="gramStart"/>
-      <w:r>
-        <w:t>P(</w:t>
-      </w:r>
-      <w:proofErr w:type="gramEnd"/>
-      <w:r>
-        <w:t xml:space="preserve">x | c) into a product of one term per feature. </w:t>
-      </w:r>
-      <w:proofErr w:type="spellStart"/>
-      <w:r>
-        <w:t>GaussianNB</w:t>
-      </w:r>
-      <w:proofErr w:type="spellEnd"/>
-      <w:r>
-        <w:t xml:space="preserve"> estimates each numeric term with a per-class </w:t>
-      </w:r>
-      <w:proofErr w:type="gramStart"/>
-      <w:r>
-        <w:t>mean</w:t>
-      </w:r>
-      <w:proofErr w:type="gramEnd"/>
-      <w:r>
-        <w:t xml:space="preserve"> and variance; </w:t>
+        <w:t xml:space="preserve"> estimates each numeric term with a per-class mean and variance; </w:t>
       </w:r>
       <w:proofErr w:type="spellStart"/>
       <w:r>
@@ -3630,18 +4073,11 @@
       </w:r>
       <w:proofErr w:type="spellEnd"/>
       <w:r>
-        <w:t xml:space="preserve"> treats every (</w:t>
+        <w:t xml:space="preserve"> treats every (standardised) feature as continuous and models each with a per-class normal distribution; its key hyperparameter, </w:t>
       </w:r>
       <w:proofErr w:type="spellStart"/>
       <w:r>
-        <w:t>standardised</w:t>
-      </w:r>
-      <w:proofErr w:type="spellEnd"/>
-      <w:r>
-        <w:t xml:space="preserve">) feature as continuous and models each with a per-class normal distribution; its key hyperparameter, </w:t>
-      </w:r>
-      <w:proofErr w:type="spellStart"/>
-      <w:r>
+        <w:lastRenderedPageBreak/>
         <w:t>var_smoothing</w:t>
       </w:r>
       <w:proofErr w:type="spellEnd"/>
@@ -3699,11 +4135,7 @@
       </w:r>
       <w:proofErr w:type="spellEnd"/>
       <w:r>
-        <w:t xml:space="preserve"> that always predicts the most frequent training class was </w:t>
-      </w:r>
-      <w:r>
-        <w:lastRenderedPageBreak/>
-        <w:t>also fitted as a majority-class baseline: any model unable to clearly beat it has learned nothing real from the features. Beyond inspecting the reported accuracy figures, both tuned estimators were also passed through scikit-</w:t>
+        <w:t xml:space="preserve"> that always predicts the most frequent training class was also fitted as a majority-class baseline: any model unable to clearly beat it has learned nothing real from the features. Beyond inspecting the reported accuracy figures, both tuned estimators were also passed through scikit-</w:t>
       </w:r>
       <w:proofErr w:type="spellStart"/>
       <w:r>
@@ -3776,15 +4208,7 @@
     </w:p>
     <w:p>
       <w:r>
-        <w:t xml:space="preserve">The trained models were evaluated on the untouched 10,994-row test set using accuracy, weighted precision, weighted recall, weighted F1-score, one-vs-rest multi-class ROC-AUC, confusion matrices and per-class classification reports. Table 2 </w:t>
-      </w:r>
-      <w:proofErr w:type="spellStart"/>
-      <w:r>
-        <w:t>summarises</w:t>
-      </w:r>
-      <w:proofErr w:type="spellEnd"/>
-      <w:r>
-        <w:t xml:space="preserve"> the headline numbers.</w:t>
+        <w:t>The trained models were evaluated on the untouched 10,994-row test set using accuracy, weighted precision, weighted recall, weighted F1-score, one-vs-rest multi-class ROC-AUC, confusion matrices and per-class classification reports. Table 2 summarises the headline numbers.</w:t>
       </w:r>
     </w:p>
     <w:p>
@@ -4249,6 +4673,7 @@
         <w:rPr>
           <w:noProof/>
         </w:rPr>
+        <w:lastRenderedPageBreak/>
         <w:drawing>
           <wp:inline distT="0" distB="0" distL="0" distR="0" wp14:anchorId="463E4AA9" wp14:editId="5EC31A65">
             <wp:extent cx="5120640" cy="2292244"/>
@@ -4294,7 +4719,6 @@
         <w:rPr>
           <w:i/>
         </w:rPr>
-        <w:lastRenderedPageBreak/>
         <w:t xml:space="preserve">Figure 9. Confusion matrices for </w:t>
       </w:r>
       <w:proofErr w:type="spellStart"/>
@@ -4407,21 +4831,16 @@
     </w:p>
     <w:p>
       <w:r>
-        <w:t>For a diagnostic-support tool, the class that matters most is Abnormal, and accuracy alone hides the asymmetry between its error types: low recall means truly abnormal results predicted as normal - false negatives that could delay diagnosis, the most dangerous failure mode - while low precision means normal patients flagged abnormal, causing unnecessary follow-up and anxiety. Here, precision for Abnormal sits at roughly 33-34% for the baseline and both trained models alike: a clinician acting on this model's abnormal flag would be right about one time in three, no better than guessing.</w:t>
+        <w:t xml:space="preserve">For a diagnostic-support tool, the class that matters most is Abnormal, and accuracy alone hides the asymmetry between its error types: low recall means truly abnormal results predicted as </w:t>
+      </w:r>
+      <w:r>
+        <w:lastRenderedPageBreak/>
+        <w:t>normal - false negatives that could delay diagnosis, the most dangerous failure mode - while low precision means normal patients flagged abnormal, causing unnecessary follow-up and anxiety. Here, precision for Abnormal sits at roughly 33-34% for the baseline and both trained models alike: a clinician acting on this model's abnormal flag would be right about one time in three, no better than guessing.</w:t>
       </w:r>
     </w:p>
     <w:p>
       <w:r>
-        <w:lastRenderedPageBreak/>
-        <w:t xml:space="preserve">The per-class classification reports add nuance the weighted averages hide. Both trained models spread their predictions across the classes with per-class precision, recall and F1 all clustered near one third, while the baseline achieves recall of 1.00 on its single predicted class (Abnormal) and zero on the others - which is why its weighted precision (0.1125) and F1 (0.1685) are so poor despite matching accuracy. That </w:t>
-      </w:r>
-      <w:proofErr w:type="gramStart"/>
-      <w:r>
-        <w:t>the trained</w:t>
-      </w:r>
-      <w:proofErr w:type="gramEnd"/>
-      <w:r>
-        <w:t xml:space="preserve"> models beat the baseline on precision and F1 but not accuracy is exactly the signature of models that produce varied but uninformative predictions.</w:t>
+        <w:t>The per-class classification reports add nuance the weighted averages hide. Both trained models spread their predictions across the classes with per-class precision, recall and F1 all clustered near one third, while the baseline achieves recall of 1.00 on its single predicted class (Abnormal) and zero on the others - which is why its weighted precision (0.1125) and F1 (0.1685) are so poor despite matching accuracy. That the trained models beat the baseline on precision and F1 but not accuracy is exactly the signature of models that produce varied but uninformative predictions.</w:t>
       </w:r>
     </w:p>
     <w:p>
@@ -4698,7 +5117,6 @@
         <w:rPr>
           <w:noProof/>
         </w:rPr>
-        <w:lastRenderedPageBreak/>
         <w:drawing>
           <wp:inline distT="0" distB="0" distL="0" distR="0" wp14:anchorId="7F31C99D" wp14:editId="3410801A">
             <wp:extent cx="5120640" cy="5106800"/>
@@ -4745,7 +5163,24 @@
           <w:i/>
           <w:sz w:val="20"/>
         </w:rPr>
-        <w:t>Screenshot 4b. Categorical value validation: proves every categorical column contains only its documented values (e.g. Gender is exactly {Male, Female}) with no unexpected categories or blank/whitespace-only entries.</w:t>
+        <w:lastRenderedPageBreak/>
+        <w:t xml:space="preserve">Screenshot 4b. Categorical value </w:t>
+      </w:r>
+      <w:proofErr w:type="gramStart"/>
+      <w:r>
+        <w:rPr>
+          <w:i/>
+          <w:sz w:val="20"/>
+        </w:rPr>
+        <w:t>validation:</w:t>
+      </w:r>
+      <w:proofErr w:type="gramEnd"/>
+      <w:r>
+        <w:rPr>
+          <w:i/>
+          <w:sz w:val="20"/>
+        </w:rPr>
+        <w:t xml:space="preserve"> proves every categorical column contains only its documented values (e.g. Gender is exactly {Male, Female}) with no unexpected categories or blank/whitespace-only entries.</w:t>
       </w:r>
     </w:p>
     <w:p>
@@ -4756,7 +5191,6 @@
         <w:rPr>
           <w:noProof/>
         </w:rPr>
-        <w:lastRenderedPageBreak/>
         <w:drawing>
           <wp:inline distT="0" distB="0" distL="0" distR="0" wp14:anchorId="780F26DB" wp14:editId="78528F59">
             <wp:extent cx="5120640" cy="2689489"/>
@@ -5179,7 +5613,7 @@
           <w:i/>
           <w:sz w:val="20"/>
         </w:rPr>
-        <w:t>Screenshot 10b. Proof of training: sklearn</w:t>
+        <w:t xml:space="preserve">Screenshot 10b. Proof of training: </w:t>
       </w:r>
       <w:proofErr w:type="spellStart"/>
       <w:r>
@@ -5187,7 +5621,7 @@
           <w:i/>
           <w:sz w:val="20"/>
         </w:rPr>
-        <w:t>'s</w:t>
+        <w:t>sklearn's</w:t>
       </w:r>
       <w:proofErr w:type="spellEnd"/>
       <w:r>
@@ -5328,7 +5762,6 @@
         <w:rPr>
           <w:noProof/>
         </w:rPr>
-        <w:lastRenderedPageBreak/>
         <w:drawing>
           <wp:inline distT="0" distB="0" distL="0" distR="0" wp14:anchorId="63450DF6" wp14:editId="6B357599">
             <wp:extent cx="5120640" cy="3552156"/>
@@ -5375,6 +5808,7 @@
           <w:i/>
           <w:sz w:val="20"/>
         </w:rPr>
+        <w:lastRenderedPageBreak/>
         <w:t>Screenshot 12. Per-class classification reports for all models.</w:t>
       </w:r>
     </w:p>
@@ -5455,11 +5889,7 @@
       </w:r>
       <w:proofErr w:type="spellEnd"/>
       <w:r>
-        <w:t xml:space="preserve"> et al., 2024). More immediately, a model whose ROC-AUC is indistinguishable from 0.5 provides no discriminative signal and must not inform real clinical decisions: wrong predictions of normal or abnormal outcomes could cause misdiagnosis, delayed treatment or unnecessary intervention. Bias is a further concern - if demographic subgroups (for example, by insurance </w:t>
-      </w:r>
-      <w:r>
-        <w:lastRenderedPageBreak/>
-        <w:t>provider, a proxy for socioeconomic status) were systematically mis-predicted, an AI system could quietly widen existing healthcare inequities, a risk repeatedly flagged in the clinical-AI ethics literature (Benzinger et al., 2023).</w:t>
+        <w:t xml:space="preserve"> et al., 2024). More immediately, a model whose ROC-AUC is indistinguishable from 0.5 provides no discriminative signal and must not inform real clinical decisions: wrong predictions of normal or abnormal outcomes could cause misdiagnosis, delayed treatment or unnecessary intervention. Bias is a further concern - if demographic subgroups (for example, by insurance provider, a proxy for socioeconomic status) were systematically mis-predicted, an AI system could quietly widen existing healthcare inequities, a risk repeatedly flagged in the clinical-AI ethics literature (Benzinger et al., 2023).</w:t>
       </w:r>
     </w:p>
     <w:p>
@@ -5474,9 +5904,11 @@
     </w:p>
     <w:p>
       <w:r>
+        <w:lastRenderedPageBreak/>
         <w:t>Future implications. Performance could plausibly improve with clinically meaningful features - laboratory values, vital signs, prior history or longitudinal records - in place of administrative fields. With richer data, ensemble methods or deep learning on time-series clinical data become worth revisiting, paired with explainability techniques such as SHAP to build clinician trust. Any deployed model would additionally require continuous monitoring and periodic retraining to prevent performance drift as hospital processes and patient populations change.</w:t>
       </w:r>
     </w:p>
+    <w:p/>
     <w:p>
       <w:pPr>
         <w:pStyle w:val="Heading1"/>
@@ -5489,11 +5921,7 @@
     </w:p>
     <w:p>
       <w:r>
-        <w:t xml:space="preserve">This project loaded 55,500 hospital records, cleaned and type-converted them (removing 534 duplicates), explored them visually and statistically, engineered a Length of Stay feature, and trained two tuned Naive Bayes variants to predict test results. Both models performed at chance level, and the report demonstrated - through association tests, a majority-class baseline and ROC-AUC analysis - that this ceiling belongs to the dataset, not the algorithm. The work </w:t>
-      </w:r>
-      <w:r>
-        <w:lastRenderedPageBreak/>
-        <w:t>illustrates a principle central to responsible AI in healthcare: knowing, and showing, when a model should not be trusted is as important as building one that can be.</w:t>
+        <w:t>This project loaded 55,500 hospital records, cleaned and type-converted them (removing 534 duplicates), explored them visually and statistically, engineered a Length of Stay feature, and trained two tuned Naive Bayes variants to predict test results. Both models performed at chance level, and the report demonstrated - through association tests, a majority-class baseline and ROC-AUC analysis - that this ceiling belongs to the dataset, not the algorithm. The work illustrates a principle central to responsible AI in healthcare: knowing, and showing, when a model should not be trusted is as important as building one that can be.</w:t>
       </w:r>
     </w:p>
     <w:p>
@@ -5940,7 +6368,7 @@
   <w:endnote w:type="separator" w:id="-1">
     <w:p>
       <w:pPr>
-        <w:spacing w:after="0" w:line="240" w:lineRule="auto"/>
+        <w:spacing w:line="240" w:lineRule="auto"/>
       </w:pPr>
       <w:r>
         <w:separator/>
@@ -5950,7 +6378,7 @@
   <w:endnote w:type="continuationSeparator" w:id="0">
     <w:p>
       <w:pPr>
-        <w:spacing w:after="0" w:line="240" w:lineRule="auto"/>
+        <w:spacing w:line="240" w:lineRule="auto"/>
       </w:pPr>
       <w:r>
         <w:continuationSeparator/>
@@ -5977,9 +6405,6 @@
       <w:fldChar w:fldCharType="separate"/>
     </w:r>
     <w:r>
-      <w:rPr>
-        <w:noProof/>
-      </w:rPr>
       <w:t>1</w:t>
     </w:r>
     <w:r>
@@ -5994,7 +6419,7 @@
   <w:footnote w:type="separator" w:id="-1">
     <w:p>
       <w:pPr>
-        <w:spacing w:after="0" w:line="240" w:lineRule="auto"/>
+        <w:spacing w:line="240" w:lineRule="auto"/>
       </w:pPr>
       <w:r>
         <w:separator/>
@@ -6004,7 +6429,7 @@
   <w:footnote w:type="continuationSeparator" w:id="0">
     <w:p>
       <w:pPr>
-        <w:spacing w:after="0" w:line="240" w:lineRule="auto"/>
+        <w:spacing w:line="240" w:lineRule="auto"/>
       </w:pPr>
       <w:r>
         <w:continuationSeparator/>
@@ -6185,6 +6610,95 @@
       <w:rPr>
         <w:rFonts w:ascii="Symbol" w:hAnsi="Symbol" w:hint="default"/>
       </w:rPr>
+    </w:lvl>
+  </w:abstractNum>
+  <w:abstractNum w:abstractNumId="9" w15:restartNumberingAfterBreak="0">
+    <w:nsid w:val="250155AF"/>
+    <w:multiLevelType w:val="hybridMultilevel"/>
+    <w:tmpl w:val="15A26B4E"/>
+    <w:lvl w:ilvl="0" w:tplc="4409000F">
+      <w:start w:val="1"/>
+      <w:numFmt w:val="decimal"/>
+      <w:lvlText w:val="%1."/>
+      <w:lvlJc w:val="left"/>
+      <w:pPr>
+        <w:ind w:left="720" w:hanging="360"/>
+      </w:pPr>
+      <w:rPr>
+        <w:rFonts w:hint="default"/>
+      </w:rPr>
+    </w:lvl>
+    <w:lvl w:ilvl="1" w:tplc="44090019">
+      <w:start w:val="1"/>
+      <w:numFmt w:val="lowerLetter"/>
+      <w:lvlText w:val="%2."/>
+      <w:lvlJc w:val="left"/>
+      <w:pPr>
+        <w:ind w:left="1440" w:hanging="360"/>
+      </w:pPr>
+    </w:lvl>
+    <w:lvl w:ilvl="2" w:tplc="4409001B" w:tentative="1">
+      <w:start w:val="1"/>
+      <w:numFmt w:val="lowerRoman"/>
+      <w:lvlText w:val="%3."/>
+      <w:lvlJc w:val="right"/>
+      <w:pPr>
+        <w:ind w:left="2160" w:hanging="180"/>
+      </w:pPr>
+    </w:lvl>
+    <w:lvl w:ilvl="3" w:tplc="4409000F" w:tentative="1">
+      <w:start w:val="1"/>
+      <w:numFmt w:val="decimal"/>
+      <w:lvlText w:val="%4."/>
+      <w:lvlJc w:val="left"/>
+      <w:pPr>
+        <w:ind w:left="2880" w:hanging="360"/>
+      </w:pPr>
+    </w:lvl>
+    <w:lvl w:ilvl="4" w:tplc="44090019" w:tentative="1">
+      <w:start w:val="1"/>
+      <w:numFmt w:val="lowerLetter"/>
+      <w:lvlText w:val="%5."/>
+      <w:lvlJc w:val="left"/>
+      <w:pPr>
+        <w:ind w:left="3600" w:hanging="360"/>
+      </w:pPr>
+    </w:lvl>
+    <w:lvl w:ilvl="5" w:tplc="4409001B" w:tentative="1">
+      <w:start w:val="1"/>
+      <w:numFmt w:val="lowerRoman"/>
+      <w:lvlText w:val="%6."/>
+      <w:lvlJc w:val="right"/>
+      <w:pPr>
+        <w:ind w:left="4320" w:hanging="180"/>
+      </w:pPr>
+    </w:lvl>
+    <w:lvl w:ilvl="6" w:tplc="4409000F" w:tentative="1">
+      <w:start w:val="1"/>
+      <w:numFmt w:val="decimal"/>
+      <w:lvlText w:val="%7."/>
+      <w:lvlJc w:val="left"/>
+      <w:pPr>
+        <w:ind w:left="5040" w:hanging="360"/>
+      </w:pPr>
+    </w:lvl>
+    <w:lvl w:ilvl="7" w:tplc="44090019" w:tentative="1">
+      <w:start w:val="1"/>
+      <w:numFmt w:val="lowerLetter"/>
+      <w:lvlText w:val="%8."/>
+      <w:lvlJc w:val="left"/>
+      <w:pPr>
+        <w:ind w:left="5760" w:hanging="360"/>
+      </w:pPr>
+    </w:lvl>
+    <w:lvl w:ilvl="8" w:tplc="4409001B" w:tentative="1">
+      <w:start w:val="1"/>
+      <w:numFmt w:val="lowerRoman"/>
+      <w:lvlText w:val="%9."/>
+      <w:lvlJc w:val="right"/>
+      <w:pPr>
+        <w:ind w:left="6480" w:hanging="180"/>
+      </w:pPr>
     </w:lvl>
   </w:abstractNum>
   <w:num w:numId="1" w16cid:durableId="2085909678">
@@ -6213,6 +6727,9 @@
   </w:num>
   <w:num w:numId="9" w16cid:durableId="1231229619">
     <w:abstractNumId w:val="0"/>
+  </w:num>
+  <w:num w:numId="10" w16cid:durableId="399402070">
+    <w:abstractNumId w:val="9"/>
   </w:num>
 </w:numbering>
 </file>
@@ -6606,13 +7123,15 @@
   <w:style w:type="paragraph" w:default="1" w:styleId="Normal">
     <w:name w:val="Normal"/>
     <w:qFormat/>
-    <w:rsid w:val="00FC693F"/>
+    <w:rsid w:val="00E66430"/>
     <w:pPr>
-      <w:spacing w:line="360" w:lineRule="auto"/>
+      <w:spacing w:after="0" w:line="360" w:lineRule="auto"/>
+      <w:jc w:val="both"/>
     </w:pPr>
     <w:rPr>
       <w:rFonts w:ascii="Times New Roman" w:eastAsia="Times New Roman" w:hAnsi="Times New Roman"/>
       <w:sz w:val="24"/>
+      <w:lang w:val="en-MY"/>
     </w:rPr>
   </w:style>
   <w:style w:type="paragraph" w:styleId="Heading1">
@@ -6620,22 +7139,21 @@
     <w:basedOn w:val="Normal"/>
     <w:next w:val="Normal"/>
     <w:link w:val="Heading1Char"/>
+    <w:autoRedefine/>
     <w:uiPriority w:val="9"/>
     <w:qFormat/>
-    <w:rsid w:val="00FC693F"/>
+    <w:rsid w:val="00E66430"/>
     <w:pPr>
       <w:keepNext/>
       <w:keepLines/>
-      <w:spacing w:before="480" w:after="0"/>
       <w:outlineLvl w:val="0"/>
     </w:pPr>
     <w:rPr>
-      <w:rFonts w:asciiTheme="majorHAnsi" w:eastAsiaTheme="majorEastAsia" w:hAnsiTheme="majorHAnsi" w:cstheme="majorBidi"/>
+      <w:rFonts w:eastAsiaTheme="majorEastAsia" w:cs="Times New Roman"/>
       <w:b/>
       <w:bCs/>
       <w:color w:val="000000"/>
-      <w:sz w:val="28"/>
-      <w:szCs w:val="28"/>
+      <w:szCs w:val="24"/>
     </w:rPr>
   </w:style>
   <w:style w:type="paragraph" w:styleId="Heading2">
@@ -6643,22 +7161,21 @@
     <w:basedOn w:val="Normal"/>
     <w:next w:val="Normal"/>
     <w:link w:val="Heading2Char"/>
+    <w:autoRedefine/>
     <w:uiPriority w:val="9"/>
     <w:unhideWhenUsed/>
     <w:qFormat/>
-    <w:rsid w:val="00FC693F"/>
+    <w:rsid w:val="00E66430"/>
     <w:pPr>
       <w:keepNext/>
       <w:keepLines/>
-      <w:spacing w:before="200" w:after="0"/>
       <w:outlineLvl w:val="1"/>
     </w:pPr>
     <w:rPr>
-      <w:rFonts w:asciiTheme="majorHAnsi" w:eastAsiaTheme="majorEastAsia" w:hAnsiTheme="majorHAnsi" w:cstheme="majorBidi"/>
+      <w:rFonts w:eastAsiaTheme="majorEastAsia" w:cstheme="majorBidi"/>
       <w:b/>
       <w:bCs/>
       <w:color w:val="000000"/>
-      <w:sz w:val="26"/>
       <w:szCs w:val="26"/>
     </w:rPr>
   </w:style>
@@ -6674,7 +7191,7 @@
     <w:pPr>
       <w:keepNext/>
       <w:keepLines/>
-      <w:spacing w:before="200" w:after="0"/>
+      <w:spacing w:before="200"/>
       <w:outlineLvl w:val="2"/>
     </w:pPr>
     <w:rPr>
@@ -6697,7 +7214,7 @@
     <w:pPr>
       <w:keepNext/>
       <w:keepLines/>
-      <w:spacing w:before="200" w:after="0"/>
+      <w:spacing w:before="200"/>
       <w:outlineLvl w:val="3"/>
     </w:pPr>
     <w:rPr>
@@ -6722,7 +7239,7 @@
     <w:pPr>
       <w:keepNext/>
       <w:keepLines/>
-      <w:spacing w:before="200" w:after="0"/>
+      <w:spacing w:before="200"/>
       <w:outlineLvl w:val="4"/>
     </w:pPr>
     <w:rPr>
@@ -6743,7 +7260,7 @@
     <w:pPr>
       <w:keepNext/>
       <w:keepLines/>
-      <w:spacing w:before="200" w:after="0"/>
+      <w:spacing w:before="200"/>
       <w:outlineLvl w:val="5"/>
     </w:pPr>
     <w:rPr>
@@ -6766,7 +7283,7 @@
     <w:pPr>
       <w:keepNext/>
       <w:keepLines/>
-      <w:spacing w:before="200" w:after="0"/>
+      <w:spacing w:before="200"/>
       <w:outlineLvl w:val="6"/>
     </w:pPr>
     <w:rPr>
@@ -6789,7 +7306,7 @@
     <w:pPr>
       <w:keepNext/>
       <w:keepLines/>
-      <w:spacing w:before="200" w:after="0"/>
+      <w:spacing w:before="200"/>
       <w:outlineLvl w:val="7"/>
     </w:pPr>
     <w:rPr>
@@ -6812,7 +7329,7 @@
     <w:pPr>
       <w:keepNext/>
       <w:keepLines/>
-      <w:spacing w:before="200" w:after="0"/>
+      <w:spacing w:before="200"/>
       <w:outlineLvl w:val="8"/>
     </w:pPr>
     <w:rPr>
@@ -6863,7 +7380,7 @@
         <w:tab w:val="center" w:pos="4680"/>
         <w:tab w:val="right" w:pos="9360"/>
       </w:tabs>
-      <w:spacing w:after="0" w:line="240" w:lineRule="auto"/>
+      <w:spacing w:line="240" w:lineRule="auto"/>
     </w:pPr>
   </w:style>
   <w:style w:type="character" w:customStyle="1" w:styleId="HeaderChar">
@@ -6885,7 +7402,7 @@
         <w:tab w:val="center" w:pos="4680"/>
         <w:tab w:val="right" w:pos="9360"/>
       </w:tabs>
-      <w:spacing w:after="0" w:line="240" w:lineRule="auto"/>
+      <w:spacing w:line="240" w:lineRule="auto"/>
     </w:pPr>
   </w:style>
   <w:style w:type="character" w:customStyle="1" w:styleId="FooterChar">
@@ -6909,14 +7426,15 @@
     <w:basedOn w:val="DefaultParagraphFont"/>
     <w:link w:val="Heading1"/>
     <w:uiPriority w:val="9"/>
-    <w:rsid w:val="00FC693F"/>
+    <w:rsid w:val="00E66430"/>
     <w:rPr>
-      <w:rFonts w:asciiTheme="majorHAnsi" w:eastAsiaTheme="majorEastAsia" w:hAnsiTheme="majorHAnsi" w:cstheme="majorBidi"/>
+      <w:rFonts w:ascii="Times New Roman" w:eastAsiaTheme="majorEastAsia" w:hAnsi="Times New Roman" w:cs="Times New Roman"/>
       <w:b/>
       <w:bCs/>
-      <w:color w:val="365F91" w:themeColor="accent1" w:themeShade="BF"/>
-      <w:sz w:val="28"/>
-      <w:szCs w:val="28"/>
+      <w:color w:val="000000"/>
+      <w:sz w:val="24"/>
+      <w:szCs w:val="24"/>
+      <w:lang w:val="en-MY"/>
     </w:rPr>
   </w:style>
   <w:style w:type="character" w:customStyle="1" w:styleId="Heading2Char">
@@ -6924,14 +7442,15 @@
     <w:basedOn w:val="DefaultParagraphFont"/>
     <w:link w:val="Heading2"/>
     <w:uiPriority w:val="9"/>
-    <w:rsid w:val="00FC693F"/>
+    <w:rsid w:val="00E66430"/>
     <w:rPr>
-      <w:rFonts w:asciiTheme="majorHAnsi" w:eastAsiaTheme="majorEastAsia" w:hAnsiTheme="majorHAnsi" w:cstheme="majorBidi"/>
+      <w:rFonts w:ascii="Times New Roman" w:eastAsiaTheme="majorEastAsia" w:hAnsi="Times New Roman" w:cstheme="majorBidi"/>
       <w:b/>
       <w:bCs/>
-      <w:color w:val="4F81BD" w:themeColor="accent1"/>
-      <w:sz w:val="26"/>
+      <w:color w:val="000000"/>
+      <w:sz w:val="24"/>
       <w:szCs w:val="26"/>
+      <w:lang w:val="en-MY"/>
     </w:rPr>
   </w:style>
   <w:style w:type="character" w:customStyle="1" w:styleId="Heading3Char">
@@ -17639,6 +18158,18 @@
       <w:u w:val="single"/>
     </w:rPr>
   </w:style>
+  <w:style w:type="paragraph" w:styleId="NormalWeb">
+    <w:name w:val="Normal (Web)"/>
+    <w:basedOn w:val="Normal"/>
+    <w:uiPriority w:val="99"/>
+    <w:semiHidden/>
+    <w:unhideWhenUsed/>
+    <w:rsid w:val="00CA2E17"/>
+    <w:rPr>
+      <w:rFonts w:cs="Times New Roman"/>
+      <w:szCs w:val="24"/>
+    </w:rPr>
+  </w:style>
 </w:styles>
 </file>
 

</xml_diff>